<commit_message>
Proofcheck Inn Trouble Turkish: SIGNIFICANT-borderline (25 fixes)
Co-Authored-By: Claude Opus 5.5 <noreply@anthropic.com>
Claude-Session: https://claude.ai/code/session_012Cm8JxdqzjuttdUSdkQCUg
</commit_message>
<xml_diff>
--- a/translated/corrected/Inn Trouble - ASSEMBLED - FORMATTED_Turkish.docx
+++ b/translated/corrected/Inn Trouble - ASSEMBLED - FORMATTED_Turkish.docx
@@ -527,7 +527,7 @@
     <w:p/>
     <w:p>
       <w:r>
-        <w:t xml:space="preserve">Telefon çaldığında, ellerim derinlemesine turta hamurunun içindeydi; daha ellerimi kurutmaya bile fırsat bulamadan işin kötü olduğunu anlamıştım, çünkü kulübemizdeki telefon neredeyse hiç çalmazdı. İnsanlar çoğunlukla kapıyı çalar, notlu bir çocuk gönderir ya da sizi pazarda yakalardı. Telefon çaldığında bu genelde yeni gelen merinos yününü görüp görmediğimi öğrenmek isteyen Olivia olurdu ya da çemberin hangi öğleden sonra toplanacağını hatırlatan Martha. Dolayısıyla, gri bir sabahın sekiz buçukunda, sessiz mutfakta cırtlak bir sesle çaldığında, daha odanın ortasından geçmeden midem kasıldı.</w:t>
+        <w:t xml:space="preserve">Ertesi sabah telefon çaldığında, ellerim derinlemesine turta hamurunun içindeydi; daha ellerimi kurutmaya bile fırsat bulamadan işin kötü olduğunu anlamıştım, çünkü kulübemizdeki telefon neredeyse hiç çalmazdı. İnsanlar çoğunlukla kapıyı çalar, notlu bir çocuk gönderir ya da sizi pazarda yakalardı. Telefon çaldığında bu genelde yeni gelen merinos yününü görüp görmediğimi öğrenmek isteyen Olivia olurdu ya da çemberin hangi öğleden sonra toplanacağını hatırlatan Martha. Dolayısıyla, gri bir sabahın sekiz buçukunda, sessiz mutfakta cırtlak bir sesle çaldığında, daha odanın ortasından geçmeden midem kasıldı.</w:t>
       </w:r>
     </w:p>
     <w:p/>
@@ -599,7 +599,7 @@
     <w:p/>
     <w:p>
       <w:r>
-        <w:t xml:space="preserve">Ben daha yarı yola varmadan Fiona yan kapıdan çıkageldi; yüzü süzgün ve solgundu, hırkasının düğmeleri bugün düzgündü ama ona dair her şey yanlıştı. Soğuk bir elini koluma dolayarak beni lobinin yanındaki, özel konuşmalar ve arkadaşlarla içilen öğleden sonra çayları için ayırdığı küçük oturma odasına soktu. Arkamızdan kapıyı kapattığında, uyanan hanın boğuk sesleri kesildi. Köşedeki dedem saatinden çıkan tik tak sesi odadaki en yüksek sesti.</w:t>
+        <w:t xml:space="preserve">Ben daha yarı yola varmadan Fiona yan kapıdan çıkageldi; yüzü süzgün ve solgundu, hırkasının düğmeleri bugün düzgündü ama ona dair her şey yanlıştı. Soğuk bir elini koluma dolayarak beni lobinin yanındaki, özel konuşmalar ve arkadaşlarla içilen öğleden sonra çayları için ayırdığı küçük oturma odasına soktu. Arkamızdan kapıyı kapattığında, uyanan hanın boğuk sesleri kesildi. Köşedeki dede saatinden çıkan tik tak sesi odadaki en yüksek sesti.</w:t>
       </w:r>
     </w:p>
     <w:p/>
@@ -641,7 +641,7 @@
     <w:p/>
     <w:p>
       <w:r>
-        <w:t xml:space="preserve">İki kez baştan sona okudum. Dedem saati tik tak ediyordu. İfadelerdeki bir şey kafama takıldı. Kalbindeki safir. Bir şantajcının çalınmış bir taşı adlandırması için tuhaf, yumuşak, neredeyse şefkatli bir yol; bir kitaptan koparılıp alınmış bir ifade gibiydi. Üzerinde durmadım. O an bir yabancının ifade biçiminden çok daha büyük meselelerim vardı karşımda.</w:t>
+        <w:t xml:space="preserve">İki kez baştan sona okudum. Dede saati tik tak ediyordu. İfadelerdeki bir şey kafama takıldı. Kalbindeki safir. Bir şantajcının çalınmış bir taşı adlandırması için tuhaf, yumuşak, neredeyse şefkatli bir yol; bir kitaptan koparılıp alınmış bir ifade gibiydi. Üzerinde durmadım. O an bir yabancının ifade biçiminden çok daha büyük meselelerim vardı karşımda.</w:t>
       </w:r>
     </w:p>
     <w:p/>
@@ -683,7 +683,7 @@
     <w:p/>
     <w:p>
       <w:r>
-        <w:t xml:space="preserve">— 1924 yılında büyük büyükannem Constance Okafor, Blackburnler'in yanında hizmetçi olarak çalışıyordu, dedi. Gençti. On dokuz, belki yirmi yaşında. O zamanlar Frost Falls’taki en zengin aileydi onlar, elli millik alandaki en zenginler; o da odalarını temizler, ateşlerini yakar, o broş da dahil eşyalarının tozunu alırdı, gün be gün. — Titreyen bir nefes aldı. — Ve bir kış, Constance onu aldı. Çaldı, Jessica. O broşu, doğrudan makyaj masasından ya da kutusunun içinden, tam olarak nasıl bilmiyorum ama aldı. Ve o evden çıkarıp bir daha hiç geri dönmedi.</w:t>
+        <w:t xml:space="preserve">— 1924 yılında büyük büyükannem Constance Okafor, Blackburnlerin yanında hizmetçi olarak çalışıyordu, dedi. Gençti. On dokuz, belki yirmi yaşında. O zamanlar Frost Falls’taki en zengin aileydi onlar, elli millik alandaki en zenginler; o da odalarını temizler, ateşlerini yakar, o broş da dahil eşyalarının tozunu alırdı, gün be gün. — Titreyen bir nefes aldı. — Ve bir kış, Constance onu aldı. Çaldı, Jessica. O broşu, doğrudan makyaj masasından ya da kutusunun içinden, tam olarak nasıl bilmiyorum ama aldı. Ve o evden çıkarıp bir daha hiç geri dönmedi.</w:t>
       </w:r>
     </w:p>
     <w:p/>
@@ -701,7 +701,7 @@
     <w:p/>
     <w:p>
       <w:r>
-        <w:t>Bunun ağırlığı küçük odaya çöktü. Bir elimde fotoğraf ve diğerinde notla oturup durumu kavramaya çalıştım. Kasabenin yarısının bir zamanlar bir şeyleri kutladığı han, bir yüzyıl önce yapılmış bir hırsızlığın üzerine kurulmuştu.</w:t>
+        <w:t>Bunun ağırlığı küçük odaya çöktü. Bir elimde fotoğraf ve diğerinde notla oturup durumu kavramaya çalıştım. Kasabanın yarısının bir zamanlar bir şeyleri kutladığı han, bir yüzyıl önce yapılmış bir hırsızlığın üzerine kurulmuştu.</w:t>
       </w:r>
     </w:p>
     <w:p/>
@@ -1093,7 +1093,7 @@
     <w:p/>
     <w:p>
       <w:r>
-        <w:t xml:space="preserve">Bir süre daha orada durup altın rengindeki kasabayı izledik, ardından yatak odasına çıktık. Karanlıkta, iki şeyi aynı anda zihnimde tutarak uzun süre uyanık yattım. Frost Falls’un bir yerlerinde bir insan Blackburn kutularının arasında durmuş ve iyi bir kadının boğazına yarım milyon dolar için elini dolamanın bir yolunu bulmuştu. Ve çitle çevrili çayırın ötesinde kocam, adını koymayacağı bir sürpriz inşa ediyordu; ışıklar kendi kendine altına dönüşürken ve yanımızda getirdiğimiz büyü konacak bir yer bulmak için karanlıkta avlanıyordu.</w:t>
+        <w:t xml:space="preserve">Bir süre daha orada durup altın rengindeki kasabayı izledik, ardından yatak odasına çıktık. Karanlıkta, iki şeyi aynı anda zihnimde tutarak uzun süre uyanık yattım. Frost Falls’un bir yerlerinde bir insan Blackburn kutularının arasında durmuş ve iyi bir kadının boğazına yarım milyon dolar için elini dolamanın bir yolunu bulmuştu. Ve ağılın ötesinde kocam, adını koymayacağı bir sürpriz inşa ediyordu; ışıklar kendi kendine altına dönüşürken ve yanımızda getirdiğimiz büyü konacak bir yer bulmak için karanlıkta avlanıyordu.</w:t>
       </w:r>
     </w:p>
     <w:p/>
@@ -1203,7 +1203,7 @@
     <w:p/>
     <w:p>
       <w:r>
-        <w:t xml:space="preserve">Neil’a doğru yöneldim, çünkü Neil tam da görmek istediğim şeyin yanına kadar gelmişti. Sergi, içinde yarım düzine eski mektubun yelpaze gibi açıldığı uzun bir cam vitrinden ibaretti; mürekkep kahverengileşmiş, kâğıtların kenarları sararmıştı ve vitrinde Theo’nun el yazısıyla yazılmış şu kart duruyordu: </w:t>
+        <w:t xml:space="preserve">Neil’e doğru yöneldim, çünkü Neil tam da görmek istediğim şeyin yanına kadar gelmişti. Sergi, içinde yarım düzine eski mektubun yelpaze gibi açıldığı uzun bir cam vitrinden ibaretti; mürekkep kahverengileşmiş, kâğıtların kenarları sararmıştı ve vitrinde Theo’nun el yazısıyla yazılmış şu kart duruyordu: </w:t>
       </w:r>
       <w:r>
         <w:rPr>
@@ -1668,7 +1668,7 @@
     <w:p/>
     <w:p>
       <w:r>
-        <w:t xml:space="preserve">— Bram'e söyleyin. Geçen hafta Maple Caddesi'ndeki Comet için ona bir uyarı yazdım ve bana bunun için teşekkür etti. — Dudaklarının bir kenarı kıvrıldı. — Kimse bana bir uyarı için teşekkür etmez.</w:t>
+        <w:t xml:space="preserve">— Bram'a söyleyin. Geçen hafta Maple Caddesi'ndeki Comet için ona bir uyarı yazdım ve bana bunun için teşekkür etti. — Dudaklarının bir kenarı kıvrıldı. — Kimse bana bir uyarı için teşekkür etmez.</w:t>
       </w:r>
     </w:p>
     <w:p/>
@@ -1728,7 +1728,7 @@
     <w:p/>
     <w:p>
       <w:r>
-        <w:t>Frost Falls'ta uyanan her neyse, komitenin ortalıkta dolanıp durduğu sahnede değil, çayırlığın kenarındaki o paramparça bal kabağının içinden çıkıp gelmişti.</w:t>
+        <w:t>Frost Falls'ta uyanan her neyse, komitenin ortalıkta dolanıp durduğu sahnede değil, meydanın kenarındaki o paramparça bal kabağının içinden çıkıp gelmişti.</w:t>
       </w:r>
     </w:p>
     <w:p/>
@@ -2223,7 +2223,7 @@
     <w:p/>
     <w:p>
       <w:r>
-        <w:t xml:space="preserve">Haklıydı elbet, yine de bunu dile getirmedim. Soğuk bahçeye çıkıp elimi düzce Dancer’ın sıcak omzuna koydum. İzin verdi, hatta hafifçe yaslandı. Bram’in peşinden bir adım bile yürümezdi ama ben onu hiç zorlanmadan ağıla doğru yolun karşısına geçirdim. Kapı açık ve sıradandı. Onu içeri sokup mandalladım. Üçümüz öylece durup mandala baktık. Mandal kapalı kaldı. Dancer burnunu üst parmaklığın üzerinden uzatıp Bram'le bana doğru uzun, ılık bir iç çekti.</w:t>
+        <w:t xml:space="preserve">Haklıydı elbet, yine de bunu dile getirmedim. Soğuk bahçeye çıkıp elimi düzce Dancer’ın sıcak omzuna koydum. İzin verdi, hatta hafifçe yaslandı. Bram’ın peşinden bir adım bile yürümezdi ama ben onu hiç zorlanmadan ağıla doğru yolun karşısına geçirdim. Kapı açık ve sıradandı. Onu içeri sokup mandalladım. Üçümüz öylece durup mandala baktık. Mandal kapalı kaldı. Dancer burnunu üst parmaklığın üzerinden uzatıp Bram'la bana doğru uzun, ılık bir iç çekti.</w:t>
       </w:r>
     </w:p>
     <w:p/>
@@ -2247,7 +2247,7 @@
     <w:p/>
     <w:p>
       <w:r>
-        <w:t xml:space="preserve">— Teselli olacaksa ben de dışarıda tutuluyorum, dedim ona, ve bu onu gerçekten teselli etmiş gibi göründü; bir haksızlığı paylaşmanın getirdiği o küçük, çelimsiz yoldaşlık tesellisi. Bram’i, kapı üzerinde verimli bir şekilde endişelenmeye bıraktım —ki bu Bram’in en sevdiği ve zararsız hâliydi— ve kocamı bulmaya gittim.</w:t>
+        <w:t xml:space="preserve">— Teselli olacaksa ben de dışarıda tutuluyorum, dedim ona, ve bu onu gerçekten teselli etmiş gibi göründü; bir haksızlığı paylaşmanın getirdiği o küçük, çelimsiz yoldaşlık tesellisi. Bram’ı, kapı üzerinde verimli bir şekilde endişelenmeye bıraktım —ki bu Bram’ın en sevdiği ve zararsız hâliydi— ve kocamı bulmaya gittim.</w:t>
       </w:r>
     </w:p>
     <w:p/>
@@ -2925,7 +2925,7 @@
     </w:p>
     <w:p>
       <w:r>
-        <w:t xml:space="preserve">— Yarınki gazete. Üçüncü sayfa. — Claire iğnelerinden başını kaldırmadı. — Kapıları Ocak ayına kadar açık tutmak için oylama yaptılar, sonrasında ne olacağını kimse bilmiyor. İki saat boyunca oturup dinledim. Theo, deliği kendi açmış gibi sürekli çatısı için özür dileyip durdu.</w:t>
+        <w:t xml:space="preserve">— Yarınki gazete. Üçüncü sayfa. — Claire iğnelerinden başını kaldırmadı. — Kapıları ocak ayına kadar açık tutmak için oylama yaptılar, sonrasında ne olacağını kimse bilmiyor. İki saat boyunca oturup dinledim. Theo, deliği kendi açmış gibi sürekli çatısı için özür dileyip durdu.</w:t>
       </w:r>
     </w:p>
     <w:p>
@@ -3504,7 +3504,7 @@
     <w:p/>
     <w:p>
       <w:r>
-        <w:t xml:space="preserve">— Bir insanın korkunç bir şeyi her yaptığı yolla, dedi Nick. Kendi kendine bunun iyi bir şey için olduğuna inandırılarak, tekrar tekrar, sonunda kendini inandırdığı o iyilikten başka bir şey göremeyene ve zarar, gözünün ucunda ufalıp uzaklaşana kadar. Sana bunu yapma izni veren sevgidir, Jess. Acımasız olan kısım da budur. Theo kendisi için asla bir kuruş çalmazdı. Cemiyet için neredeyse her şeye kendini ikna ederdi.</w:t>
+        <w:t xml:space="preserve">— Bir insanın korkunç bir şeyi her yaptığı yolla, dedi Nick. Kendini bunun iyi bir şey için olduğuna inandırarak, tekrar tekrar, sonunda kendini inandırdığı o iyilikten başka bir şey göremeyene ve zarar, gözünün ucunda ufalıp uzaklaşana kadar. Ona bunu yapma izni veren sevgidir, Jess. Acımasız olan kısım da budur. Theo kendisi için asla bir kuruş çalmazdı. Cemiyet için neredeyse her şeye kendini ikna ederdi.</w:t>
       </w:r>
     </w:p>
     <w:p/>
@@ -3924,7 +3924,7 @@
     </w:p>
     <w:p>
       <w:r>
-        <w:t>Bu meselenin bütün yolları aynı kapıya çıkıyordu. Her birine, biri oraya varmadan önce başka bir yere saptırır umuduyla yürümüştüm ama hiçbiri saptırmamıştı.</w:t>
+        <w:t>Bu meselenin bütün yolları aynı kapıya çıkıyordu. Her birine, biri oraya varmadan önce başka bir yere sapar umuduyla yürümüştüm ama hiçbiri sapmamıştı.</w:t>
       </w:r>
     </w:p>
     <w:p>
@@ -4325,13 +4325,13 @@
     <w:p/>
     <w:p>
       <w:r>
-        <w:t xml:space="preserve">Dedem saatinin tıkırtıları eşliğinde o küçük masanın başında dosyayı okudu. Pip, pirinç sarkaç camın arkasında sallanırken izlemek için kendini saatin önüne dikmişti ve Fiona okurken gözlerini ondan hiç ayırmadı. Fiona ağladı, ama bu günlerdir onda gördüğüm ağlamalardan farklıydı. Baştan sona bir rahatlama hakimdi buna.</w:t>
-      </w:r>
-    </w:p>
-    <w:p/>
-    <w:p>
-      <w:r>
-        <w:t xml:space="preserve">— Öyle çok korktum ki, dedi. Yıllar ve yıllar boyunca. Baştan sona anlatıldığında hatta… o sadece annesini kurtarmaya çalışan bir kızmış. Tek yaptığı buymuş. Annesini kurtarmaya çalışan bir kız.</w:t>
+        <w:t xml:space="preserve">Dede saatinin tıkırtıları eşliğinde o küçük masanın başında dosyayı okudu. Pip, pirinç sarkaç camın arkasında sallanırken izlemek için kendini saatin önüne dikmişti ve Fiona okurken gözlerini ondan hiç ayırmadı. Fiona ağladı, ama bu günlerdir onda gördüğüm ağlamalardan farklıydı. Baştan sona bir rahatlama hakimdi buna.</w:t>
+      </w:r>
+    </w:p>
+    <w:p/>
+    <w:p>
+      <w:r>
+        <w:t xml:space="preserve">— Öyle çok korktum ki, dedi. Yıllar ve yıllar boyunca. Baştan sona anlatıldığında hiç de… olmayan bir şeyden… o sadece annesini kurtarmaya çalışan bir kızmış. Tek yaptığı buymuş. Annesini kurtarmaya çalışan bir kız.</w:t>
       </w:r>
     </w:p>
     <w:p/>
@@ -4361,7 +4361,7 @@
     <w:p/>
     <w:p>
       <w:r>
-        <w:t>Böylece ayarladık. Bir tuzak değil. Nazikçe, sıcak bir ortamda, oda içinde hem yasa hem de merhametle birlikte gerçekleştirilen bir hesaplaşma. Festivalin son öğleden sonrasında, akşam kalabalığı gelmeden ve ortalık henüz toplanmaya başlamadan hemen önce hanın bir saatliğine sessizliğe bürüneceği o zaman diliminde.</w:t>
+        <w:t>Böylece ayarladık. Bir tuzak değil. Nazikçe, sıcak bir ortamda, oda içinde hem yasa hem de merhametle birlikte gerçekleştirilen bir hesaplaşma. Festivalin son öğleden sonrasında, akşamdan önce, kalabalık evine dağılmışken ve ortalık henüz toplanmaya başlamamışken hanın bir saatliğine sessizliğe bürüneceği o zaman diliminde.</w:t>
       </w:r>
     </w:p>
     <w:p/>
@@ -4378,7 +4378,7 @@
     <w:p/>
     <w:p>
       <w:r>
-        <w:t xml:space="preserve">Bunu festivalin son öğleden sonrasında, Fiona’nın küçük oturma odasında yaptık; pencereden fuarın yavaş yavaş sessizleşen sesleri, eve dönmekten yakınan bir çocuk, çayırda katlanan seyyar masaların gıcırtıları içeri süzülüyordu. Noriko, Theo’yu gelip Cemiyet meselesi diye adlandırdığı bir konuyu konuşmaya çağırmış, Vera’yı da belediye başkanlığından bir iş bahanesiyle gelmesi için yönlendirmişti. İkisi de aradan birkaç dakika geçerek, birbirlerinden habersiz, ayrı ayrı geldiler.</w:t>
+        <w:t xml:space="preserve">Bunu festivalin son öğleden sonrasında, Fiona’nın küçük oturma odasında yaptık; pencereden fuarın yavaş yavaş sessizleşen sesleri, eve dönmekten yakınan bir çocuk, meydanda katlanan seyyar masaların gıcırtıları içeri süzülüyordu. Noriko, Theo’yu gelip Cemiyet meselesi diye adlandırdığı bir konuyu konuşmaya çağırmış, Vera’yı da belediye başkanlığından bir iş bahanesiyle gelmesi için yönlendirmişti. İkisi de aradan birkaç dakika geçerek, birbirlerinden habersiz, ayrı ayrı geldiler.</w:t>
       </w:r>
     </w:p>
     <w:p/>
@@ -4456,7 +4456,7 @@
     <w:p/>
     <w:p>
       <w:r>
-        <w:t xml:space="preserve">— Bana geldi, dedi. Haftalar önce. Aklı kafasından gitmiş bir hâlde Cemiyet’ten bahsediyordu, bunu bulduğunu ve tek başına yapamayacağını anlatıyordu. Hayır demem gerekirdi. Hayır demem gerektiğini biliyordum, o an da biliyordum bunu. — Kollarını kendine sıkıca sararak biraz sallandı. — Ama o kadar geride kaldım ki, Bayan Claus. Belediye başkanı bana kuruş ödemiyor ama canımı çıkarana kadar çalıştırıyor; uykusuz geceler geçirmeme neden olan, inanamayacağınız kadar çok borcum var. Theo bunun yüz yıl önce zengin bir aileden çalınmış para olduğunu, Cemiyet’i kurtaracağını, bir kısmının da bana kalacağını ve nihayet bu yükten kurtulacağımı söyledi. Kulağa neredeyse soylu bir şeymiş gibi getirdi. Bu konuda pek beceriklidir; bir işi suç gibi değil de tarih gibi göstermeyi iyi bilir. Yükten o kadar çok kurtulmak istiyordum ki onun bunu böyle göstermesine izin verdim, çünkü buna inanmak istiyordum. — Yıkılmış bir hâlde Fiona’ya baktı. — Seni bir insan olarak hiç düşünmedim. En kötüsü de bu, taşıyacağım yük bu olacak. Sadece parayı ve uykusuzluğu düşündüm. Özür dilerim. Çok özür dilerim, Fiona.</w:t>
+        <w:t xml:space="preserve">— Bana geldi, dedi. Haftalar önce. Aklı kafasından gitmiş bir hâlde Cemiyet’ten bahsediyordu, bunu bulduğunu ve tek başına yapamayacağını anlatıyordu. Hayır demem gerekirdi. Hayır demem gerektiğini biliyordum, o an da biliyordum bunu. — Kollarını kendine sıkıca sararak biraz sallandı. — Ama o kadar geride kaldım ki, Bayan Claus. Belediye başkanı bana kuruş ödemiyor ama canımı çıkarana kadar çalıştırıyor; uykusuz geceler geçirmeme neden olan, inanamayacağınız kadar çok borcum var. Theo bunun yüz yıl önce zengin bir aileden çalınmış para olduğunu, Cemiyet’i kurtaracağını, bir kısmının da bana kalacağını ve nihayet bu yükten kurtulacağımı söyledi. Kulağa neredeyse soylu bir şeymiş gibi gelmesini sağladı. Bu konuda pek beceriklidir; bir işi suç gibi değil de tarih gibi göstermeyi iyi bilir. Yükten o kadar çok kurtulmak istiyordum ki onun bunu böyle göstermesine izin verdim, çünkü buna inanmak istiyordum. — Yıkılmış bir hâlde Fiona’ya baktı. — Seni bir insan olarak hiç düşünmedim. En kötüsü de bu, taşıyacağım yük bu olacak. Sadece parayı ve uykusuzluğu düşündüm. Özür dilerim. Çok özür dilerim, Fiona.</w:t>
       </w:r>
     </w:p>
     <w:p/>
@@ -4641,7 +4641,7 @@
     <w:p/>
     <w:p>
       <w:r>
-        <w:t xml:space="preserve">— Bir kurtarışı geri çeviriyorum, dedim. İyiliğinizi değil, onu asla. Ve eğer gerçekten samimiyseniz, bunun yerine sizden şunu rica ederim. Kasaba önce kendi denesin. Kermeslerini, o utangaç küçük çekilişlerini yapsın ve kendi hafızası için neleri göze alabileceğini kendi görsün. Ve sonra, eğer gücü yetmezse, Frost Falls elinden gelen her şeyi yaptığı halde yine de tam olarak başaramazsa, geri gelin. Bütün köprü olmayın, köprünün son taşı olun. Çoğunu kasaba inşa etsin. O zaman köprü onların olur.</w:t>
+        <w:t xml:space="preserve">— Bir kurtarışı geri çeviriyorum, dedim. İyiliğinizi değil, onu asla. Ve eğer gerçekten samimiyseniz, bunun yerine sizden şunu rica ederim. Kasaba önce kendi denesin. Kermeslerini, o biraz utanç verici küçük çekilişlerini yapsın ve kendi hafızası için neleri göze alabileceğini kendi görsün. Ve sonra, eğer gücü yetmezse, Frost Falls elinden gelen her şeyi yaptığı halde yine de tam olarak başaramazsa, geri gelin. Bütün köprü olmayın, köprünün son taşı olun. Çoğunu kasaba inşa etsin. O zaman köprü onların olur.</w:t>
       </w:r>
     </w:p>
     <w:p/>
@@ -4781,7 +4781,7 @@
     <w:p/>
     <w:p>
       <w:r>
-        <w:t xml:space="preserve">Dünyanın tepesinden yarı yabancı olarak inmiştim; her soğuk sabah daha üstüme oturmamış bir kabanı giymek için uzanıyordum. Ve Frost Falls'da gördüğüm en kötü olayın ortasında, zor bir şeyi gerektiği gibi yaparken, kaban üstüme oturmuştu. Kimse oturup bunu planlamamıştı. Burayı, burası için doğru olan zor şeyi yapacak kadar çok sevmiştim. Buranın insanları bunu yaptığımı izlemiş ve o ağır, dolambaçlı tarzlarıyla benim onlardan biri olduğuma karar vermişlerdi.</w:t>
+        <w:t xml:space="preserve">Dünyanın tepesinden yarı yabancı olarak inmiştim; her soğuk sabah daha üstüme oturmamış bir kabanı giymek için uzanıyordum. Ve Frost Falls'ta gördüğüm en kötü olayın ortasında, zor bir şeyi gerektiği gibi yaparken, kaban üstüme oturmuştu. Kimse oturup bunu planlamamıştı. Burayı, burası için doğru olan zor şeyi yapacak kadar çok sevmiştim. Buranın insanları bunu yaptığımı izlemiş ve o ağır, dolambaçlı tarzlarıyla benim onlardan biri olduğuma karar vermişlerdi.</w:t>
       </w:r>
     </w:p>
     <w:p/>
@@ -5385,7 +5385,7 @@
     </w:p>
     <w:p>
       <w:r>
-        <w:t xml:space="preserve">— Bu da tuhaf doğrusu, dedi o yumuşak tonuyla ve sesindeki o hafiflik hepimizin başını kaldırmasına neden oldu. — Dün çocukların kardan adamları yola bakmıyordu sanki?</w:t>
+        <w:t xml:space="preserve">— Bu da tuhaf doğrusu, dedi o yumuşak tonuyla ve sesindeki o hafiflik hepimizin başını kaldırmasına neden oldu. — Dün çocukların kardan adamları hep yola bakmıyor muydu?</w:t>
       </w:r>
     </w:p>
     <w:p>

</xml_diff>

<commit_message>
Full proofcheck Inn Trouble Turkish: SIGNIFICANT (85 edits)
Co-Authored-By: Claude Opus 5.5 <noreply@anthropic.com>
Claude-Session: https://claude.ai/code/session_012Cm8JxdqzjuttdUSdkQCUg
</commit_message>
<xml_diff>
--- a/translated/corrected/Inn Trouble - ASSEMBLED - FORMATTED_Turkish.docx
+++ b/translated/corrected/Inn Trouble - ASSEMBLED - FORMATTED_Turkish.docx
@@ -147,7 +147,7 @@
     <w:p/>
     <w:p>
       <w:r>
-        <w:t>Kabın etrafına kareli bir bez sarıp köşelerini iyice bastırdım. Sonra, bir gezintiye çıkacağına söz verilmiş ve bunu sonuna kadar talep etmeye kararlı bir yaratığın o asil ve karşı konulmaz havasıyla arka kapının dibine kurulmuş olan Pip'e baktım.</w:t>
+        <w:t>Kabın etrafına kareli bir bez sarıp köşelerini iyice bastırdım. Sonra, bir gezintiye çıkacağına söz verilmiş ve bunu sonuna kadar talep etmeye kararlı bir yaratığın o apaçık havasıyla arka kapının dibine kurulmuş olan Pip'e baktım.</w:t>
       </w:r>
     </w:p>
     <w:p/>
@@ -159,7 +159,7 @@
     <w:p/>
     <w:p>
       <w:r>
-        <w:t xml:space="preserve">Kapıyı açar açmaz, sanki bekleyen ben değilmişim de o benim üzerime titriyormuş gibi, o kısa ve keskin "acele et" anlamına gelen cıvıltısını bir kez kopardı, kuyruk tüylerini salladı ve ben kapıyı açar açmaz verandaya süzüldü.</w:t>
+        <w:t xml:space="preserve">Sanki onu bekleyen ben değilmişim de beni bekleyen oymuş gibi, o kısa ve keskin "acele et" anlamına gelen cıvıltısını bir kez kopardı, kuyruk tüylerini salladı ve ben kapıyı açar açmaz paytak paytak verandaya çıktı.</w:t>
       </w:r>
     </w:p>
     <w:p/>
@@ -171,19 +171,19 @@
     <w:p/>
     <w:p>
       <w:r>
-        <w:t xml:space="preserve">Bayılıyordum buna. İlk soğuk sabahla birlikte örümcek ağları asılmıştı ve ben uzun ömrümün çok büyük bir kısmını, tek komşuların elfler ve ren geyikleri olduğu, bir atölyede kendi kendine mırıldanan bir koca ile birlikte bir yerde geçirdiğim için, bal kabağı dolu bir sokağı asla sıradan bir şey olarak görmeyecektim. Bay Kim, tamirhanenin önüne, her biri kafasında küçük kâğıttan bir tamirci şapkasıyla bir sıra bal kabağı oyup dizmişti. Gazette bürosunun vitrininde gazete okuyan bir iskelet vardı. Aralarında Olivia'nın olduğunu tahmin ettiğim biri, </w:t>
+        <w:t xml:space="preserve">Bayılıyordum buna. İlk soğuk sabahla birlikte örümcek ağları asılmıştı ve ben uzun ömrümün çok büyük bir kısmını, tek komşuların elfler ve ren geyikleri olduğu, bir atölyede kendi kendine mırıldanan bir koca ile birlikte bir yerde geçirdiğim için, bal kabağı dolu bir sokağı asla sıradan bir şey olarak görmeyecektim. Bay Kim, tamirhanenin önüne, her biri kafasında küçük kâğıttan bir tamirci şapkasıyla bir sıra bal kabağı oyup dizmişti. Gazette bürosunun vitrininde gazete okuyan bir iskelet vardı. Biri —Olivia olduğundan şüpheleniyordum— </w:t>
       </w:r>
       <w:r>
         <w:t xml:space="preserve"/>
       </w:r>
       <w:r>
-        <w:t xml:space="preserve">Yarn Tales</w:t>
-      </w:r>
-      <w:r>
-        <w:t xml:space="preserve">'in</w:t>
-      </w:r>
-      <w:r>
-        <w:t xml:space="preserve"> önündeki yangın musluğuna turuncu bir şapka örmüştü.</w:t>
+        <w:t xml:space="preserve">Yarn Tales'ın önündeki</w:t>
+      </w:r>
+      <w:r>
+        <w:t xml:space="preserve"/>
+      </w:r>
+      <w:r>
+        <w:t xml:space="preserve"> yangın musluğuna turuncu bir şapka örmüştü.</w:t>
       </w:r>
     </w:p>
     <w:p/>
@@ -204,7 +204,7 @@
         <w:t xml:space="preserve"/>
       </w:r>
       <w:r>
-        <w:t xml:space="preserve">, Evergreen Caddesi'nin kasaba meydanına doğru genişlediği yerde duruyordu; kış göğünün o yumuşak gri-yeşil rengine boyanmış, bir arkadaşın omuzuna atılmış bir kol gibi iki yanını saran verandası olan, yüksek, beşik çatılı bir evdi. Orada sonradan inşa edilmiş gibi değil de sanki orada büyümüş gibi duruyordu. Fiona ön kapıya bir çelenk asmıştı; her geçtiğimde yaptığım gibi ben de merdivenlerin dibinde durup onu hayranlıkla inceledim. Koyu ve gür, üzerinde kendi yaldızladığı kozalaklar bulunan geniş altın rengi bir kurdeleyle sarılmış, mevsime uygun turuncu renkli tek bir taflan dalıyla süslenmiş şişman bir çam çelengiydi.</w:t>
+        <w:t xml:space="preserve">, Evergreen Caddesi'nin kasaba meydanına doğru genişlediği yerde duruyordu; kış göğünün o yumuşak gri-yeşil rengine boyanmış, bir arkadaşın omuzuna atılmış bir kol gibi iki yanını saran verandası olan, yüksek, beşik çatılı bir evdi. Orada sonradan inşa edilmiş gibi değil de sanki orada büyümüş gibi duruyordu. Fiona ön kapıya bir çelenk asmıştı; her geçtiğimde yaptığım gibi ben de merdivenlerin dibinde durup onu hayranlıkla inceledim. Koyu ve gür, geniş altın rengi bir kurdeleyle sarılmış, kendi yaldızladığı kozalaklarla bezenmiş, mevsime uygun turuncu renkli tek bir taflan dalıyla süslenmiş şişman bir çam çelengiydi.</w:t>
       </w:r>
     </w:p>
     <w:p/>
@@ -240,7 +240,7 @@
     <w:p/>
     <w:p>
       <w:r>
-        <w:t>Resepsiyon bankosunun arkasında durmuş, elindeki tükenmez kalemi usta bir hareketle döndürüyordu. Fiona neşe saçmak için yaratılmış bir kadındı. Yuvarlak hatlı, kıpır kıpır, hareket etmeye ve gülmeye her an hazır, gülüşü derinlerden başlayıp bir anda bütün yüzüne yayılan biriydi. Neşe, kapısı açık bırakılmış bir odadan ısının kaçması gibi içinden çekilip gitmişti. Gözlerinin altında pudranın örtemediği koyu halkalar vardı. Hırkasının düğmelerinden birini yanlış iliklemişti. Beni gördüğünde, göz altındaki o gölgelerden bile çok canımı sıkan o şeyi yaptı: yüzünü yeniden düzenledi. Gülümsemeyi, taşımaktan artık çok yorulduğu bir paltoyu giyer gibi bilerek ve isteyerek üzerine geçirdi ve bankonun etrafından dolaşarak bana doğru geldi.</w:t>
+        <w:t>Resepsiyon bankosunun arkasında durmuş, elindeki kalemi parmaklarının arasında çevirip duruyordu. Fiona neşe saçmak için yaratılmış bir kadındı. Yuvarlak hatlı, kıpır kıpır, hareket etmeye ve gülmeye her an hazır, gülüşü derinlerden başlayıp bir anda bütün yüzüne yayılan biriydi. Neşe, kapısı açık bırakılmış bir odadan ısının kaçması gibi içinden çekilip gitmişti. Gözlerinin altında pudranın örtemediği koyu halkalar vardı. Hırkasının düğmelerinden birini yanlış iliklemişti. Beni gördüğünde, göz altındaki o gölgelerden bile çok canımı sıkan o şeyi yaptı: yüzünü yeniden düzenledi. Gülümsemeyi, taşımaktan artık çok yorulduğu bir paltoyu giyer gibi bilerek ve isteyerek üzerine geçirdi ve bankonun etrafından dolaşarak bana doğru geldi.</w:t>
       </w:r>
     </w:p>
     <w:p/>
@@ -360,13 +360,13 @@
     <w:p/>
     <w:p>
       <w:r>
-        <w:t>Sam, Cuma gününü kabul ederek pek de ters olmayan bir tavırla başını salladı ve kamyonetine doğru geri döndü. Tanımadığım bir adam, sanki o boşluğu bekliyormuş gibi, Sam'in bıraktığı yere pürüzsüzce adım attı.</w:t>
-      </w:r>
-    </w:p>
-    <w:p/>
-    <w:p>
-      <w:r>
-        <w:t xml:space="preserve">— Güzel işçilik, şu demir işleri. — Yabancı derli toplu, parlak gözlü, ellili yaşlarının ortalarında, seyahat eden insanlara mahsus o hafif buruşuk kıyafetleriyle bakımlı biriydi. Elinde gizlemeye gerek duymadığı küçük bir defter vardı. Sam'in arkasından başıyla onayladı. — Yerel bir demirci mi? Yerel olduğu her halinden belli oluyor. İşinde bir özgüven var. Ve bu ev. — Başını acele etmeden lobiyi, kıvrımlı merdiveni, tavanın ortasındaki eski alçı madalyonu incelemek için çevirdi. — İşte burası tarihi olan bir ev. Aile işletmesi olsa gerek. Kuşaklar boyudur burada.</w:t>
+        <w:t>Sam, cuma gününü kabul ederek pek de ters olmayan bir tavırla başını salladı ve kamyonetine doğru geri döndü. Tanımadığım bir adam, sanki o boşluğu bekliyormuş gibi, Sam'in bıraktığı yere pürüzsüzce adım attı.</w:t>
+      </w:r>
+    </w:p>
+    <w:p/>
+    <w:p>
+      <w:r>
+        <w:t xml:space="preserve">— Güzel işçilik, şu demir işleri. — Yabancı derli toplu, parlak gözlü, ellili yaşlarının ortalarında, seyahat eden insanlara mahsus o hafif buruşuk kıyafetleriyle bakımlı biriydi. Elinde gizlemeye gerek duymadığı küçük bir defter vardı. Sam'in arkasından başıyla işaret etti. — Yerel bir demirci mi? Yerel olduğu her halinden belli oluyor. İşinde bir özgüven var. Ve bu ev. — Başını acele etmeden lobiyi, kıvrımlı merdiveni, tavanın ortasındaki eski alçı madalyonu incelemek için çevirdi. — İşte burası tarihi olan bir ev. Aile işletmesi olsa gerek. Kuşaklar boyudur burada.</w:t>
       </w:r>
     </w:p>
     <w:p/>
@@ -764,7 +764,7 @@
     <w:p/>
     <w:p>
       <w:r>
-        <w:t xml:space="preserve">— O halde benimle bir anlığına düşün, dedim, çünkü bu her şeyden daha önemli. Bu notu her kim yazdıysa kilitli sandıkta ne olduğunu biliyor. Ve sadece senin açtığın kilitli bir sandıkta ne olduğunu bilmenin yalnızca iki yolu vardır. Ya bir şekilde sandığına girmişlerdir ki bu imkânsız olduğunu söylüyorsun. — Bir parmağımı kaldırarak devam ettim. — Ya da aynı sırra diğer taraftan yaklaşmışlardır. Blackburnlerin tarafından. Çünkü Blackburnler 1924’te bir broş kaybettiler, değil mi? Öyle bir aile bunu yazmıştır. Bir mektup, hane halkı defteri, sigortacıya yazılmış bir not, herhangi bir şey. Hikâyelerinin onların versiyonu, seninkinden bağımsız olarak bir yerlerde var olmalı.</w:t>
+        <w:t xml:space="preserve">— O halde benimle bir anlığına düşün, dedim, çünkü bu her şeyden daha önemli. Bu notu her kim yazdıysa kilitli sandıkta ne olduğunu biliyor. Ve sadece senin açtığın kilitli bir sandıkta ne olduğunu bilmenin yalnızca iki yolu vardır. Ya bir şekilde sandığına girmişlerdir ki bu imkânsız olduğunu söylüyorsun. — Bir parmağımı kaldırarak devam ettim. — Ya da aynı sırra diğer taraftan yaklaşmışlardır. Blackburnlerin tarafından. Çünkü Blackburnler 1924’te bir broş kaybettiler, değil mi? Öyle bir aile bunu yazmıştır. Bir mektup, hane halkı defteri, sigortacıya yazılmış bir not, herhangi bir şey. Hikâyenin onların versiyonu, seninkinden bağımsız olarak bir yerlerde var olmalı.</w:t>
       </w:r>
     </w:p>
     <w:p/>
@@ -937,13 +937,13 @@
     <w:p/>
     <w:p>
       <w:r>
-        <w:t xml:space="preserve">Bu çok doğruydu ve bana çorbanın verdiğinden daha çok cesaret verdi; çünkü bir arkadaşa duyulan hastalıklı, sarsıntılı şüpheyi üzerinde çalışabileceğim somut bir soruya dönüştürmüştü. Bir yerlerde, birileri sessizlik içinde Blackburn kutularının arasında durmuş, okumaya hakları olmayan şeyleri okumuş ve işin içinde yarım milyon doların gölgesini görmüştü. O kişi Theo olabilirdi. Olmayabilirdi de. Bunu adil bir şekilde öğrenmeliydim.</w:t>
-      </w:r>
-    </w:p>
-    <w:p/>
-    <w:p>
-      <w:r>
-        <w:t xml:space="preserve">— Sergi yarın açılıyor, dedim. Arşiv sergisi. Eski belgelerin hepsi teşhir edilecek, eski haritalar, mektuplar ve fotoğraflar. Hazırlamak için Cemiyette yatıp kalkıyor Theo, Martha günlerdir eve uğramadığını söylüyor. Ve kasabanın yarısı açılışta orada olacak.</w:t>
+        <w:t xml:space="preserve">Bu çok doğruydu ve beni çorbadan da çok toparladı; çünkü bir arkadaşa duyulan hastalıklı, sarsıntılı şüpheyi üzerinde çalışabileceğim somut bir soruya dönüştürmüştü. Bir yerlerde, birileri sessizlik içinde Blackburn kutularının arasında durmuş, okumaya hakları olmayan şeyleri okumuş ve işin içinde yarım milyon doların gölgesini görmüştü. O kişi Theo olabilirdi. Olmayabilirdi de. Bunu adil bir şekilde öğrenmeliydim.</w:t>
+      </w:r>
+    </w:p>
+    <w:p/>
+    <w:p>
+      <w:r>
+        <w:t xml:space="preserve">— Sergi yarın açılıyor, dedim. Arşiv sergisi. Eski belgelerin hepsi teşhir edilecek, eski haritalar, mektuplar ve fotoğraflar. Hazırlamak için Cemiyet’te yatıp kalkıyor Theo, Martha günlerdir eve uğramadığını söylüyor. Ve kasabanın yarısı açılışta orada olacak.</w:t>
       </w:r>
     </w:p>
     <w:p/>
@@ -1009,7 +1009,7 @@
     <w:p/>
     <w:p>
       <w:r>
-        <w:t>O gece, yatmadan önce, her zaman yaptığım gibi kasabanın geceye hazırlanışını izlemek için pencereye gittim. Kulübemiz patikanın yukarısında, diğerlerinden biraz uzaktaydı; arkasında çit çevrili alan ve ötesinde atölyenin karanlık silüeti, aşağıda ise kasaba uzanırdı. Kasaba ışıl ışıl aydınlanmıştı.</w:t>
+        <w:t>O gece, yatmadan önce, her zaman yaptığım gibi kasabanın geceye hazırlanışını izlemek için pencereye gittim. Kulübemiz patikanın yukarısında, diğerlerinden biraz uzaktaydı; arkasında ağıl ve ötesinde atölyenin karanlık silüeti, aşağıda ise kasaba uzanırdı. Kasaba ışıl ışıl aydınlanmıştı.</w:t>
       </w:r>
     </w:p>
     <w:p/>
@@ -1323,7 +1323,7 @@
     <w:p/>
     <w:p>
       <w:r>
-        <w:t>Mektuplar buradaydı. Kâğıt buradaydı.</w:t>
+        <w:t>Mektuplar burada durmuştu. Kâğıt buradaydı.</w:t>
       </w:r>
     </w:p>
     <w:p/>
@@ -1374,7 +1374,7 @@
     </w:p>
     <w:p>
       <w:r>
-        <w:t xml:space="preserve">— Saatlik yevmiyeyle çalışan kadınlar gibi örüyorsun.</w:t>
+        <w:t xml:space="preserve">— Saat başı para alan bir kadın gibi örüyorsun.</w:t>
       </w:r>
     </w:p>
     <w:p>
@@ -1414,7 +1414,7 @@
     </w:p>
     <w:p>
       <w:r>
-        <w:t xml:space="preserve">— Mesele sergi değil. — Martha şişlerini kucağına bıraktı. — Mesele para. Cemiyetin kasası tam takır, Jessica. Hakikaten tam takır. Geçen ilkbaharda, bunu kimseye itiraf etmez olmadan önce, bizzat Theo’dan duydum. Adını anmaya değer bir bağış fonları yok. Hiç olmamış da. Kasabadan aldıkları ufacık bir ödenek ve yaz panayırında topladıkları üç beş kuruşla idare ediyorlardı; ta ki kasaba iki bütçe önce o ödenekleri de kesene kadar. Arka odaların çatısı ne zaman yağmur yağsa su akıtıyor. Kalorifer kazanı benden yaşlı. Ve adam üç eyaletteki akla gelen bütün fonlara, vakıflara başvurdu. — Başını yavaşça salladı. — Reddedildi. Reddedildi. Reddedildi. Mektupların gelişini izledim durdum. Bir keresinde bana birini gösterdi, sonra onu da göstermez oldu.</w:t>
+        <w:t xml:space="preserve">— Mesele sergi değil. — Martha şişlerini kucağına bıraktı. — Mesele para. Cemiyet’in kasası tam takır, Jessica. Hakikaten tam takır. Geçen ilkbaharda, bunu kimseye itiraf etmez olmadan önce, bizzat Theo’dan duydum. Adını anmaya değer bir bağış fonları yok. Hiç olmamış da. Kasabadan aldıkları ufacık bir ödenek ve yaz panayırında topladıkları üç beş kuruşla idare ediyorlardı; ta ki kasaba iki bütçe önce o ödenekleri de kesene kadar. Arka odaların çatısı ne zaman yağmur yağsa su akıtıyor. Kalorifer kazanı benden yaşlı. Ve adam üç eyaletteki akla gelen bütün fonlara, vakıflara başvurdu. — Başını yavaşça salladı. — Reddedildi. Reddedildi. Reddedildi. Mektupların gelişini izledim durdum. Bir keresinde bana birini gösterdi, sonra onu da göstermez oldu.</w:t>
       </w:r>
     </w:p>
     <w:p>
@@ -1504,7 +1504,7 @@
     </w:p>
     <w:p>
       <w:r>
-        <w:t xml:space="preserve">Pip ile dükkândan ayrıldığımızda, bir saat sonra, ışık zayıf çay rengine bürünmüş, erkekler ise sokak lambalarının arasına festivalin son ışıklarını germek üzere meydana dönmüş, soğukta birbirlerine sesleniyorlardı. Köşede durup onları bir süre izledim, karanlıkta çekilen yeni telleri gördüm ve parayı düşündüm.</w:t>
+        <w:t xml:space="preserve">Pip ile dükkândan ayrıldığımızda, bir saat sonra, ışık zayıf çay rengine bürünmüş, erkekler ise sokak lambalarının arasına festivalin son ışıklarını germek üzere meydana dönmüş, soğukta birbirlerine sesleniyorlardı. Köşede durup onları bir süre izledim, henüz yanmayan yeni tellerin çekilişini gördüm ve parayı düşündüm.</w:t>
       </w:r>
     </w:p>
     <w:p>
@@ -1536,7 +1536,7 @@
     <w:p/>
     <w:p>
       <w:r>
-        <w:t xml:space="preserve">Festivalin yapılacağı yer, Evergreen'in güneyindeki büyük çayırlıktı; meydandan aşağı uzanan bu alanın bir ucunda savaş anıtı, en uzak ucunda ise görkemli karaağaç yer alıyordu. Bütün kasaba burayı süslemek için dökülmüştü. Ortaya seyyar masalar taşınıp sıra sıra dizilecek, kuzey ucuna bir sahne kurulacak ve üstünkörü durması gereken bir şey oluşturmak üzere binden fazla küçük süs bal kabağı yerleştirilecekti. Aslına bakılırsa komite bu bal kabaklarının etrafında bir saat boyunca pervane olacaktı. Ben festival komitesine ilk düzine eldiveni bırakmak için gelmiştim sadece; buraya varışımdan doksan saniye sonra tanımadığım bir adam elime bir kasa turta bal kabağı tutuşturmuş ve "Şunları sahnenin önüne koyar mısın rica etsem? Yumuşak olana dikkat et" demişti. Bu kasabada işler böyle yürürdü ve ben bundan hiç mi hiç rahatsız olmuyordum. Kollarımda bir kasa bal kabağıyla düşünecek halim yoktu, bu da işime geliyordu.</w:t>
+        <w:t xml:space="preserve">Festivalin yapılacağı yer, Evergreen'in güneyindeki büyük çayırlıktı; meydandan aşağı uzanan bu alanın bir ucunda savaş anıtı, en uzak ucunda ise görkemli karaağaç yer alıyordu. Bütün kasaba burayı süslemek için dökülmüştü. Ortaya seyyar masalar taşınıp sıra sıra dizilecek, kuzey ucuna bir sahne kurulacak ve üstünkörü durması gereken bir şey oluşturmak üzere bin tane gibi görünen küçük süs bal kabağı yerleştirilecekti. Aslına bakılırsa komite bu bal kabaklarının etrafında bir saat boyunca pervane olacaktı. Ben festival komitesine ilk düzine eldiveni bırakmak için gelmiştim sadece; buraya varışımdan doksan saniye sonra tanımadığım bir adam elime bir kasa turta bal kabağı tutuşturmuş ve "Şunları sahnenin önüne koyar mısın rica etsem? Yumuşak olana dikkat et" demişti. Bu kasabada işler böyle yürürdü ve ben bundan hiç mi hiç rahatsız olmuyordum. Kollarımda bir kasa bal kabağıyla düşünecek halim yoktu, bu da işime geliyordu.</w:t>
       </w:r>
     </w:p>
     <w:p/>
@@ -1566,7 +1566,7 @@
     <w:p/>
     <w:p>
       <w:r>
-        <w:t>Gülüşü neşeyle ve şaşkınlıkla döküldü dudaklarından, gerçek bir gülüş; bir çocuğun izin verip vermeyeceğine karar vermeden önce ardında bıraktığı türdendi ve bana bir haftalık uykudan daha çok iyi geldi; çünkü annesi öldükten sonra, Emma Redfern'in gülmediği uzun bir dönem olmuştu. Sarah Redfern'in hastalığı neredeyse bir yıl sürmüş, sonrasında Emma, kendisine nasıl ulaşacağını bilemeyen kasabanın içinde küçük bir gri hayalet gibi sürüklenip durmuştu. Bu ayın başlarında Martha'nın küçük köpeğini alıp götürmüştü — sekiz yaşındaki bir çocuğun içine sığdıramayacağı kadar büyük bir kederden ötürü alıp saklamış, yanında tutmuştu. Bütün kasaba aramaya çıkmıştı. Sonunda ikisini de, küçük kızı ve köpeği eski bir kulübenin orada birlikte bulmuştum ve bu bulunuş, Emma'nın yeniden kendine gelmesinin başlangıcı olmuştu. Martha'nın, yalnız bir çocuğa ayağa kalkması için bir neden ve sorumluluğunu üstleneceği sıcak bir varlık sunmak adına tamamen uydurduğu bu düzen sayesinde, şimdi haftada üç öğleden sonra köpeği gezdiriyordu; bu yöntem, kimse bunun ne amaçla yapıldığını yüksek sesle söylemese de dolambaçlı yoldan işe yaramıştı.</w:t>
+        <w:t>Gülüşü neşeyle ve şaşkınlıkla döküldü dudaklarından, gerçek bir gülüş; bir çocuğun, koyverip koyvermemeye karar vermeden ağzından kaçıveren türdendi ve bana bir haftalık uykudan daha çok iyi geldi; çünkü annesi öldükten sonra, Emma Redfern'in gülmediği uzun bir dönem olmuştu. Sarah Redfern'in hastalığı neredeyse bir yıl sürmüş, sonrasında Emma, kendisine nasıl ulaşacağını bilemeyen kasabanın içinde küçük bir gri hayalet gibi sürüklenip durmuştu. Bu ayın başlarında Martha'nın küçük köpeğini alıp götürmüştü — sekiz yaşındaki bir çocuğun içine sığdıramayacağı kadar büyük bir kederden ötürü alıp saklamış, yanında tutmuştu. Bütün kasaba aramaya çıkmıştı. Sonunda ikisini de, küçük kızı ve köpeği eski bir kulübenin orada birlikte bulmuştum ve bu bulunuş, Emma'nın yeniden kendine gelmesinin başlangıcı olmuştu. Martha'nın, yalnız bir çocuğa ayağa kalkması için bir neden ve sorumluluğunu üstleneceği sıcak bir varlık sunmak adına tamamen uydurduğu bu düzen sayesinde, şimdi haftada üç öğleden sonra köpeği gezdiriyordu; bu yöntem, kimse bunun ne amaçla yapıldığını yüksek sesle söylemese de dolambaçlı yoldan işe yaramıştı.</w:t>
       </w:r>
     </w:p>
     <w:p/>
@@ -1686,13 +1686,13 @@
     <w:p/>
     <w:p>
       <w:r>
-        <w:t xml:space="preserve">Pip'in hırpaladığı, kapağı koparılmış ve çekirdekleri soğuk çimlerin üzerine yan taraftan dökülmüş olan o fenerin yanına geri dönmüştü. Onun önünde öylece kalakalmış, ardından korku barındırmayan o küçük ve dikkatli sesiyle konuşmuştu: — Bayan Claus. Bakın.</w:t>
-      </w:r>
-    </w:p>
-    <w:p/>
-    <w:p>
-      <w:r>
-        <w:t>Gelip baktım. Ekim ayının son haftasında, ıslak turuncu etin içinden bir çobanpüskülü filizlenivermişti: üç koyu parlak yaprak, keskin kenarlı ve kusursuz; aralarında ise kan damlaları yuvarlaklığında üç kırmızı meyve, Pip'in onu paralamasından bu yana geçen bir saat içinde mahvolmuş bir Cadılar Bayramı kabağının içinden büyüyordu.</w:t>
+        <w:t xml:space="preserve">Pip'in hırpaladığı, kapağı koparılmış ve çekirdekleri soğuk çimlerin üzerine yan taraftan dökülmüş olan o fenerin yanına geri dönmüştü. Onun önünde öylece kalakalmış, ardından korku barındırmayan küçük ve dikkatli bir sesle konuştu: — Bayan Claus. Bakın.</w:t>
+      </w:r>
+    </w:p>
+    <w:p/>
+    <w:p>
+      <w:r>
+        <w:t>Gelip baktım. Ekim ayının son haftasında, ıslak turuncu etin içinden bir çobanpüskülü filizlenivermişti: üç koyu parlak yaprak, keskin kenarlı ve başka hiçbir şeyle karıştırılamayacak gibi; aralarında ise kan damlaları yuvarlaklığında üç kırmızı meyve. Pip'in onu paralamasından bu yana geçen bir saat içinde, mahvolmuş bir Cadılar Bayramı kabağının içinden büyüyüvermişti.</w:t>
       </w:r>
     </w:p>
     <w:p/>
@@ -1704,7 +1704,7 @@
     <w:p/>
     <w:p>
       <w:r>
-        <w:t xml:space="preserve">— Bunu sen mi yaptın? diye fısıldadı Emma ve sesinde gram korku yoktu, yalnızca dizginlenmiş, parıl parıl parlayan bir hayranlık vardı. — Bu bir Noel-Claus işi mi? Noel'i bir bal kabağından sen mi çıkardın?</w:t>
+        <w:t xml:space="preserve">— Bunu siz mi yaptınız? diye fısıldadı Emma ve sesinde gram korku yoktu, yalnızca dizginlenmiş, parıl parıl parlayan bir hayranlık vardı. — Bu bir Noel-Claus işi mi? Noel'i bir bal kabağından siz mi çıkardınız?</w:t>
       </w:r>
     </w:p>
     <w:p/>
@@ -1716,7 +1716,7 @@
     <w:p/>
     <w:p>
       <w:r>
-        <w:t xml:space="preserve">Emma çömeldi ve tek bir dikkatli parmak ucuyla kırmızı meyvelerden birine dokundu. — Çok güzel, dedi, o kadar alçak sesle ki neredeyse yok gibiydi. Sonra başını aniden ve şiddetle kaldırıp bana baktı. — Kimseye söyleme. Gelip onu kazıp bir kavanoza koymak isterler. Bize ait olmasına izin verelim. Sadece ikimizin ve Pip'in.</w:t>
+        <w:t xml:space="preserve">Emma çömeldi ve tek bir dikkatli parmak ucuyla kırmızı meyvelerden birine dokundu. — Çok güzel, dedi, o kadar alçak sesle ki neredeyse yok gibiydi. Sonra başını aniden ve şiddetle kaldırıp bana baktı. — Kimseye söylemeyin. Gelip onu kazıp bir kavanoza koymak isterler. Bize ait olmasına izin verelim. Sadece ikimizin ve Pip'in.</w:t>
       </w:r>
     </w:p>
     <w:p/>
@@ -1849,7 +1849,7 @@
     </w:p>
     <w:p>
       <w:r>
-        <w:t xml:space="preserve">Bu ondan gerçek bir kahkaha kopardı; birdenbire ortaya çıkan, eksikliğini çektiğim o derin kahkaha ve bunu duymak bana, çorbanın ona yaptığı kadar iyi geldi. Birlikte sandalyelerin yanına döndük. O sallananları tamir ederken ben saydım ve Pip de sıcak güneş yamasından denetledi. Bir saat boyunca han yeniden sadece bir han olmuştu; sıcak, meşgul ve festivale hazırlanan bir yer. Başka ne olursa olsun, burası korunmaya değerdi: korkmuş bir kızın hiçbir şeyden var edip yüz yıl boyunca sandalyeleri sayan başka bir kadına aktardığı sıcaklık.</w:t>
+        <w:t xml:space="preserve">Bu ondan gerçek bir kahkaha kopardı; birdenbire ortaya çıkan, eksikliğini çektiğim o derin kahkaha ve bunu duymak bana, çorbanın ona yaptığı kadar iyi geldi. Birlikte sandalyelerin yanına döndük. O sallananları tamir ederken ben saydım ve Pip de sıcak güneş yamasından denetledi. Bir saat boyunca han yeniden sadece bir han olmuştu; sıcak, meşgul ve festivale hazırlanan bir yer. Başka ne olursa olsun, burası korunmaya değerdi: korkmuş bir kızın hiçbir şeyden var edip yüz yıl sonrasına, sandalye sayan başka bir kadına devrettiği sıcaklık.</w:t>
       </w:r>
     </w:p>
     <w:p>
@@ -1877,7 +1877,7 @@
     <w:p/>
     <w:p>
       <w:r>
-        <w:t xml:space="preserve">Sam Patel örsteydi. Maşayla tuttuğu düz bir demir yıldızın tam ortası turuncu renkte parlıyordu ve her vuruşta biraz döndürerek kısa, istikrarlı darbelerle demiri şekillendiriyordu. Beni ilk başta fark etmedi, ben de onu acele ettirmedim. Pip, ateşin yaydığı sıcak halkanın sınırına kadar paytak adımlarla yürüdü ve orada durdu; neyse ki akıllı bir kuştu, turuncu ışığı başını yana eğerek izlemeye koyuldu.</w:t>
+        <w:t xml:space="preserve">Sam Patel örsteydi. Maşayla tuttuğu düz bir demir yıldızın uçlarından biri, özünde turuncu turuncu parlıyordu ve her vuruşta biraz döndürerek kısa, istikrarlı darbelerle demiri şekillendiriyordu. Beni ilk başta fark etmedi, ben de onu acele ettirmedim. Pip, ateşin yaydığı sıcak halkanın sınırına kadar paytak adımlarla yürüdü ve orada durdu; neyse ki akıllı bir kuştu, turuncu ışığı başını yana eğerek izlemeye koyuldu.</w:t>
       </w:r>
     </w:p>
     <w:p/>
@@ -1901,7 +1901,7 @@
     <w:p/>
     <w:p>
       <w:r>
-        <w:t>— Öyle olduğundan şüphem yok, dedim. — Öyle olmalı da zaten. Bu sezon kasabanın her yerinde sizin işlerinizi görüyoruz.</w:t>
+        <w:t>— Öyle olduğundan şüphem yok, dedim. Öyle olmalı da zaten. Bu sezon kasabanın her yerinde sizin işlerinizi görüyoruz.</w:t>
       </w:r>
     </w:p>
     <w:p/>
@@ -1925,13 +1925,13 @@
     <w:p/>
     <w:p>
       <w:r>
-        <w:t>— Hanı işlerini siz yaptınız, dedim rahat bir tavırla, askıyı elimde döndürerek. — Fiona’nın lobisindeki bütün o demir işleri. Şömine rafındaki yıldızlar, lamba aplikleri, şömine siperi...</w:t>
-      </w:r>
-    </w:p>
-    <w:p/>
-    <w:p>
-      <w:r>
-        <w:t xml:space="preserve">— Hepsi. — Çenesi kasıldı; zaten temiz olan bir maşayı alıp bir bezle ovmaya başladı. — Son kısmından bir kuruş gördüğüm söylenemez ya. — Yüzüme bakmıyordu. — Bana yirmi dolar borcu var. Bunun kulağa nasıl geldiğini biliyorum. Koca adam, harçlığına kalan çocuk gibi yirmi doların lafını yapıyor. Mesele para değil.</w:t>
+        <w:t>— Hanı işlerini siz yaptınız, dedim rahat bir tavırla, askıyı elimde döndürerek. Fiona’nın lobisindeki bütün o demir işleri. Şömine rafındaki yıldızlar, lamba aplikleri, şömine siperi...</w:t>
+      </w:r>
+    </w:p>
+    <w:p/>
+    <w:p>
+      <w:r>
+        <w:t xml:space="preserve">— Hepsi. — Çenesi kasıldı; zaten temiz olan bir maşayı alıp bir bezle ovmaya başladı. — Son kısmından bir kuruş gördüğüm söylenemez ya. — Yüzüme bakmıyordu. — Bana yirmi dolar borcu var. Bunun kulağa nasıl geldiğini biliyorum. Koca adam, harçlığını alamamış bir çocuk gibi yirmi doların lafını yapıyor. Mesele para değil.</w:t>
       </w:r>
     </w:p>
     <w:p/>
@@ -1943,7 +1943,7 @@
     <w:p/>
     <w:p>
       <w:r>
-        <w:t xml:space="preserve">— Üç hafta oldu ve mesele para değil, yüzüme bakmaması. — Maşayı bırakıp başka bir maşa aldı, olmayan bir kiri ovalamaya koyuldu. — Fiona’yı on yıldır tanırım. Ve şimdi ona bildiğim en nazik dille, hesabı ne zaman kapatabileceğimizi sorduğumda, yüzü kireç gibi bembeyaz oluyor, yere bakıp Cuma diyor, Cuma, ve sanki dükkâna haciz koymaya gelmişim gibi apar topar uzaklaşıyor. Bütün festival siparişini veresiye ve bir el sıkışmayla teslim ettim, seve seve yaptım; şimdi ne yirmi dolarımı alabiliyorum ne ondan net bir laf ne de göz göze gelebiliyorum, bunu anlamıyorum ve geceleri uykumu kaçırıyor.</w:t>
+        <w:t xml:space="preserve">— Üç hafta oldu ve mesele para değil, yüzüme bakmaması. — Maşayı bırakıp başka bir maşa aldı, olmayan bir kiri ovalamaya koyuldu. — Fiona’yı on yıldır tanırım. Ve şimdi ona bildiğim en nazik dille, hesabı ne zaman kapatabileceğimizi sorduğumda, yüzü kireç gibi bembeyaz oluyor, yere bakıp Cuma diyor, Cuma, ve sanki hana haciz koymaya gelmişim gibi apar topar uzaklaşıyor. Bütün festival siparişini veresiye ve bir el sıkışmayla teslim ettim, seve seve yaptım; şimdi ne yirmi dolarımı alabiliyorum ne ondan net bir laf ne de göz göze gelebiliyorum, bunu anlamıyorum ve geceleri uykumu kaçırıyor.</w:t>
       </w:r>
     </w:p>
     <w:p/>
@@ -1979,7 +1979,7 @@
     <w:p/>
     <w:p>
       <w:r>
-        <w:t xml:space="preserve">— Bu eski meselesi, eğer bir mesele ise, dedim elimden geldiğince hafif bir tonda. — Hanın ilk günleri hakkında bir şey biliyor musunuz? Fiona’nın ailesi buraya nasıl sahip olmuş, eskiden beri mi? Kulaktan kulağa yayılmış eski bir hikâye var mı?</w:t>
+        <w:t xml:space="preserve">— Bu eski meselesi, eğer bir mesele ise, dedim elimden geldiğince hafif bir tonda. Hanın ilk günleri hakkında bir şey biliyor musunuz? Fiona’nın ailesi buraya nasıl sahip olmuş, eskiden beri mi? Kulaktan kulağa yayılmış eski bir hikâye var mı?</w:t>
       </w:r>
     </w:p>
     <w:p/>
@@ -2104,7 +2104,7 @@
     <w:p/>
     <w:p>
       <w:r>
-        <w:t>Nabzım hızlı ve sert bir şekilde atmaya başladı ama yüzümü bu heyecanın üzerinde sakin tutmayı başardım. Ridgeline'ı biliyordu. Rehinci dükkânını biliyordu. Her şeye Blackburn tarafından, meşru taraftan, emlak avukatlarının açısından yaklaşmıştı ve işin izini karşı yakadan Constance Okafor'un kapısına kadar neredeyse sürmüştü.</w:t>
+        <w:t>Nabzım hızlı ve sert bir şekilde atmaya başladı ama yüzümü bu heyecanın üzerinde sakin tutmayı başardım. Ridgeline'ı biliyordu. Rehinci dükkânını biliyordu. Her şeye Blackburn tarafından, meşru taraftan, miras avukatlarının açısından yaklaşmıştı ve işin izini karşı yakadan Constance Okafor'un kapısına kadar neredeyse sürmüştü.</w:t>
       </w:r>
     </w:p>
     <w:p/>
@@ -2116,7 +2116,7 @@
     <w:p/>
     <w:p>
       <w:r>
-        <w:t xml:space="preserve">— Bu işin tamamı ev ödevi zaten. Başka bir tarafı yok. — Normal gözlüğünü çıkarıp burnunun kemerini ovuşturdu ve bir an için evinden çok uzakta, sıkıcı bir işi dikkatle yapan, sıradan, orta yaşlı ve yalnızca yorulmuş biri gibi göründü. — Bakın. Bunu size ilk gün vermeliydim. — Masanın üzerinden bana bir kart uzattı. — Herkese veririm ben bunları. Gerçekten, herkese. Kasabadaki ne kadar çok insan ne aradığımı bilirse, birinin büyükannesinin annesinin bir zamanlar söylediği bir şeyi hatırlaması ve bana bir ay kazandırması ihtimali o kadar artar.</w:t>
+        <w:t xml:space="preserve">— Bu işin tamamı ev ödevi zaten. Başka bir tarafı yok. — Normal gözlüğünü çıkarıp burnunun kemerini ovuşturdu ve bir an için evinden çok uzakta, sıkıcı bir işi dikkatle yapan, sıradan, orta yaşlı ve yalnızca yorulmuş biri gibi göründü. — Bakın. Bunu size ilk gün vermeliydim. — Masanın üzerinden bana bir kart uzattı. — Herkese veririm ben bunları. Gerçekten, herkese. Kasabadaki ne kadar çok insan ne aradığımı bilirse, birinin büyükannesinin, annesinin bir zamanlar söylediği bir şeyi hatırlaması ve bana bir ay kazandırması ihtimali o kadar artar.</w:t>
       </w:r>
     </w:p>
     <w:p/>
@@ -2182,7 +2182,7 @@
     <w:p/>
     <w:p>
       <w:r>
-        <w:t>Ve kasabadaki başka birinin minnetle arkasına sığındığı parlak bir lambaya o kadar çok benziyordu.</w:t>
+        <w:t>Ve kasabadaki başka birinin minnetle arkasına sığınıyor olabileceği parlak bir lambaya o kadar çok benziyordu.</w:t>
       </w:r>
     </w:p>
     <w:p/>
@@ -2205,7 +2205,7 @@
     <w:p/>
     <w:p>
       <w:r>
-        <w:t xml:space="preserve">— Bayan Claus! — Bram, kulübenin köşesini dörtnala dönüp kasketini elleri arasında çekiştirerek yanıma geldi. Bram bizimle güneye gelen, yerinden edilen atölyenin baş kalfası, işine sadık, telaşlı ve genel hatlarıyla endişeli bir patatesi andıran bir elfti; şu an da son derece huzursuzdu. — Dancer. Yine kendi kendine dışarı çıkmış. Bu hafta üçüncü kez, Bayan Claus, üçüncü. Ve sahip olduğum bütün düğmeler üzerine yemin ederim ki oradan ayrıldığımda o mandal indirilmişti, indirilmiş ve denenmişti; ama şimdi gelmiş güzelim lahanaları yiyor ve yola gelmiyor, inan bana, gidişatın hiç mi hiç iyi olduğunu düşünmüyorum.</w:t>
+        <w:t xml:space="preserve">— Bayan Claus! — Bram, kulübenin köşesini koşar adım dönüp kasketini elleri arasında çekiştirerek yanıma geldi. Bram bizimle güneye gelen, yerinden edilen atölyenin baş kalfası, işine sadık, telaşlı ve genel hatlarıyla endişeli bir patatesi andıran bir elfti; şu an da son derece huzursuzdu. — Dancer. Yine kendi kendine dışarı çıkmış. Bu hafta üçüncü kez, Bayan Claus, üçüncü. Ve sahip olduğum bütün düğmeler üzerine yemin ederim ki oradan ayrıldığımda o mandal indirilmişti, indirilmiş ve denenmişti; ama şimdi gelmiş güzelim lahanaları yiyor ve yola gelmiyor, inan bana, gidişatın hiç mi hiç iyi olduğunu düşünmüyorum.</w:t>
       </w:r>
     </w:p>
     <w:p/>
@@ -2307,7 +2307,7 @@
     <w:p/>
     <w:p>
       <w:r>
-        <w:t xml:space="preserve">Bir an sessiz kaldı, nefeslerimiz alaca karanlığı sisletti. — Oturabileceği bir yer, dedi sonunda, alçak sesle. Söyleyeceğim tek şey bu, ki bu bile söylememem gerekenden fazla çünkü bitmedi ve işe yarayıp yaramayacağını bilmiyorum. Arayıp durduğu şeyi inşa etmeye çalışıyorum, Jess. Bir ocak. Ta ki karanlıkta kapı kapı dolaşmayı bırakıp eve gelene ve uzanana kadar. — Elimi sıktı. — Kimseye söyleme. Biriktirilecek bir sır olduğu için değil. İşe yarayacağından emin olmadan yüksek sesle söylemek istemediğim için.</w:t>
+        <w:t xml:space="preserve">Bir an sessiz kaldı, nefeslerimiz alaca karanlığı sisletti. — Oturabileceği bir yer, dedi sonunda, alçak sesle. Söyleyeceğim tek şey bu, ki bu bile söylememem gerekenden fazla çünkü bitmedi ve işe yarayıp yaramayacağını bilmiyorum. Arayıp durduğu şeyi inşa etmeye çalışıyorum, Jess. Bir ocak. Böylece karanlıkta kapı kapı dolaşmayı bırakıp eve gelsin ve uzansın. — Elimi sıktı. — Kimseye söyleme. Biriktirilecek bir sır olduğu için değil. İşe yarayacağından emin olmadan yüksek sesle söylemek istemediğim için.</w:t>
       </w:r>
     </w:p>
     <w:p/>
@@ -2360,7 +2360,7 @@
     <w:p/>
     <w:p>
       <w:r>
-        <w:t>Giriş holünün duvarları, yaldız çerçeveli, kendilerinden memnun eski belediye başkanlarının portreleriyle doluydu ve bunların dikkat çekici bir kısmı Blackburn’lerden oluşuyordu; aynı uzun Blackburn burnu, aileden kalma gümüş bir yemek takımı gibi duvardan duvara miras bırakılmıştı. Holün diğer ucunda, şu anki başkanın kapısı sonuna kadar açıktı. Üzerinde bir telefondan ve deri bir masa altlığından başka hiçbir şey durmayan geniş, tertemiz masasının arkasında, burnu, makamı ve kasabadakilerin anladığı kadarıyla bunların dışında pek bir şeyi devralmış olan gayet sakin, gri benizli Belediye Başkanı Blackburn’ün kendisi oturuyordu.</w:t>
+        <w:t>Giriş holünün duvarları, yaldız çerçeveli, kendilerinden memnun eski belediye başkanlarının portreleriyle doluydu ve bunların dikkat çekici bir kısmı Blackburnlerden oluşuyordu; aynı uzun Blackburn burnu, aileden kalma gümüş bir yemek takımı gibi duvardan duvara miras bırakılmıştı. Holün diğer ucunda, şu anki başkanın kapısı sonuna kadar açıktı. Üzerinde bir telefondan ve deri bir masa altlığından başka hiçbir şey durmayan geniş, tertemiz masasının arkasında, burnu, makamı ve kasabadakilerin anladığı kadarıyla bunların dışında pek bir şeyi devralmış olan gayet sakin, gri benizli Belediye Başkanı Blackburn’ün kendisi oturuyordu.</w:t>
       </w:r>
     </w:p>
     <w:p/>
@@ -2408,7 +2408,7 @@
     <w:p/>
     <w:p>
       <w:r>
-        <w:t xml:space="preserve">Söylediğim, çoğu şeyde olduğu gibi, onun üstünden öylece kayıp gitti. Kendisine hiçbir maliyeti olmayan ve Cemiyete bundan da az şey kazandıracak olan zamanı için teşekkür ettim. Ardından, asıl gelme sebebim olan işi yapmak, yani gözlemlemek ve kulak kabartmak için Vera’nın masasına geri döndüm.</w:t>
+        <w:t xml:space="preserve">Söylediğim, çoğu şeyde olduğu gibi, onun üstünden öylece kayıp gitti. Kendisine hiçbir maliyeti olmayan ve Cemiyet’e bundan da az şey kazandıracak olan zamanı için teşekkür ettim. Ardından, asıl gelme sebebim olan işi yapmak, yani gözlemlemek ve kulak kabartmak için Vera’nın masasına geri döndüm.</w:t>
       </w:r>
     </w:p>
     <w:p/>
@@ -2459,7 +2459,7 @@
     <w:p/>
     <w:p>
       <w:r>
-        <w:t xml:space="preserve">— Yalnızca şunu merak ettiğim için sordum; bir arkadaşım son zamanlarda eski aileleri merak ediyordu. Blackburn’leri. İlk paranın nereden geldiğini, kuruluş günlerini. Hatta böyle bir şeyi nerede arayacağını herkesten iyi sizin bileceğinizi söylemiştim ona.</w:t>
+        <w:t xml:space="preserve">— Yalnızca şunu merak ettiğim için sordum; bir arkadaşım son zamanlarda eski aileleri merak ediyordu. Blackburnleri. İlk paranın nereden geldiğini, kuruluş günlerini. Hatta böyle bir şeyi nerede arayacağını herkesten iyi sizin bileceğinizi söylemiştim ona.</w:t>
       </w:r>
     </w:p>
     <w:p/>
@@ -2471,13 +2471,13 @@
     <w:p/>
     <w:p>
       <w:r>
-        <w:t xml:space="preserve">Başını kaldırıp bana baktı ve korumasız kaldığı o tek an boyunca, o kusursuz, yorgun yüzü bambaşka bir hâle büründü —tencerenin kapağını kapatır gibi kusursuzluğunu yeniden üzerine örtmeden hemen önce, diken üstünde, köşeye sıkışmış bir ifade belirdi gözlerinde. — Blackburn’ler hakkında hiçbir şey bilmem, dedi; iki metre ötede, açık kapısının ardında bir Blackburn otururken ve arkasındaki çekmeceleri Blackburn tapuları doldururken söylenecek tuhaf bir sözdü bu. — O, Theo’nun alanı. Tarih Cemiyeti. Ben sadece kayıtları tutuyorum. Onları okumam. — Festival listesini masa altlığının üzerinden kaydırarak bana uzattı. — İşte. Çember eklendi. Başka bir şey var mıydı?</w:t>
-      </w:r>
-    </w:p>
-    <w:p/>
-    <w:p>
-      <w:r>
-        <w:t>Bu kadar basit ve anlamsız bir soru için fazlasıyla uzun bir cevaptı ve çok aceleci çıkmıştı. Listeyi uzatırken eli pek de istikrarlı sayılmazdı. Bir şey bilmeyen insan ile o konu hakkında soru sormayı kesmeniz için can atan insan arasındaki farkı öğrenerek uzun bir ömür geçirmiştim. Vera Reed, soru sormayı kesmemi istiyordu. Blackburn’ler hakkında. Sakladığı ve asla okumadığına yemin ettiği kayıtlar hakkında.</w:t>
+        <w:t xml:space="preserve">Başını kaldırıp bana baktı ve korumasız kaldığı o tek an boyunca, o kusursuz, yorgun yüzü bambaşka bir hâle büründü —tencerenin kapağını kapatır gibi kusursuzluğunu yeniden üzerine örtmeden hemen önce, diken üstünde, köşeye sıkışmış bir ifade belirdi gözlerinde. — Blackburnler hakkında hiçbir şey bilmem, dedi; iki metre ötede, açık kapısının ardında bir Blackburn otururken ve arkasındaki çekmeceleri Blackburn tapuları doldururken söylenecek tuhaf bir sözdü bu. — O, Theo’nun alanı. Tarih Cemiyeti. Ben sadece kayıtları tutuyorum. Onları okumam. — Festival listesini masa altlığının üzerinden kaydırarak bana uzattı. — İşte. Çember eklendi. Başka bir şey var mıydı?</w:t>
+      </w:r>
+    </w:p>
+    <w:p/>
+    <w:p>
+      <w:r>
+        <w:t>Bu kadar basit ve anlamsız bir soru için fazlasıyla uzun bir cevaptı ve çok aceleci çıkmıştı. Listeyi uzatırken eli pek de istikrarlı sayılmazdı. Bir şey bilmeyen insan ile o konu hakkında soru sormayı kesmeniz için can atan insan arasındaki farkı öğrenerek uzun bir ömür geçirmiştim. Vera Reed, soru sormayı kesmemi istiyordu. Blackburnler hakkında. Sakladığı ve asla okumadığına yemin ettiği kayıtlar hakkında.</w:t>
       </w:r>
     </w:p>
     <w:p/>
@@ -2513,19 +2513,19 @@
     <w:p/>
     <w:p>
       <w:r>
-        <w:t xml:space="preserve">Üzerine çöken para sıkıntısıyla boğuşan bir kadın. Kimin neye sahip olduğuna dair yüz yıllık bilgilerin anahtarlarını elinde tutan, büyük bir malikâneden bir broşun kaybolduğu 1924 yılında kasabanın kayda geçirdiği her neyse —eğer gerçekten bir şeyler kayda geçirildiyse— </w:t>
+        <w:t xml:space="preserve">Üzerine çöken para sıkıntısıyla boğuşan bir kadın. Kimin neye sahip olduğuna dair yüz yıllık bilgilerin anahtarlarını elinde tutan; o çekmecelerin bir yerinde Winter Wonderland Inn’in tapusunun ve büyük bir malikâneden bir broşun kaybolduğu 1924 yılında kasabanın kayda geçirdiği her ne varsa —eğer gerçekten bir şey kayda geçirildiyse— onun da durduğu bir kadın.</w:t>
       </w:r>
       <w:r>
         <w:t xml:space="preserve"/>
       </w:r>
       <w:r>
-        <w:t xml:space="preserve">Winter Wonderland Inn</w:t>
-      </w:r>
-      <w:r>
-        <w:t xml:space="preserve">’in</w:t>
-      </w:r>
-      <w:r>
-        <w:t xml:space="preserve"> tapusu tam da o çekmecelerin bir yerinde bulunan bir kadın. Mülk kayıtları kelimesi geçtiğinde kaskatı kesilen, ben Blackburn adını ağzıma alır almaz fazlasıyla gevezeleşen ve arkasında duran o kayıtlara rağmen onları asla okumadığını söyleyen bir kadın.</w:t>
+        <w:t xml:space="preserve"/>
+      </w:r>
+      <w:r>
+        <w:t xml:space="preserve"/>
+      </w:r>
+      <w:r>
+        <w:t xml:space="preserve"> Mülk kayıtları kelimesi geçtiğinde kaskatı kesilen, ben Blackburn adını ağzıma alır almaz fazlasıyla gevezeleşen ve arkasında duran o kayıtlara rağmen onları asla okumadığını söyleyen bir kadın.</w:t>
       </w:r>
     </w:p>
     <w:p/>
@@ -2548,7 +2548,7 @@
     <w:p/>
     <w:p>
       <w:r>
-        <w:t xml:space="preserve">Tarih Cemiyeti’nin yönetim kurulu o Pazartesi akşamı, çatı akıtan soğuk arka odada toplandı. Claire, yarı Gazette odada dost bir yüz istediği için, yarı da —sezdiğim kadarıyla— taşıdığım yük hakkında belli ettiğinden fazlasını tahmin ettiği ve durumun ne kadar kötü olduğunu kendi gözlerimle görmemi istediği için, onunla gelmemi istedi.</w:t>
+        <w:t xml:space="preserve">Tarih Cemiyeti’nin yönetim kurulu o pazartesi akşamı, çatı akıtan soğuk arka odada toplandı. Claire, yarı Gazette odada dost bir yüz istediği için, yarı da —sezdiğim kadarıyla— taşıdığım yük hakkında belli ettiğinden fazlasını tahmin ettiği ve durumun ne kadar kötü olduğunu kendi gözlerimle görmemi istediği için, onunla gelmemi istedi.</w:t>
       </w:r>
     </w:p>
     <w:p>
@@ -2618,7 +2618,7 @@
     </w:p>
     <w:p>
       <w:r>
-        <w:t xml:space="preserve">Pip’le birlikte karanlıkta eve yürüdük ve daha önce tam olarak bilmediğim iki şeyi anladım. Cemiyet gerçekten batıyordu ve bu da önümde, teneke kovaya damla damla dökülerek tüm çıplaklığıyla ortadaydı. Ve Theo hakkında ne yaparsam yapayım, bunu nazikçe yapmam gerekecekti, çünkü yağmur ona zaten yeterince zarar vermişti.</w:t>
+        <w:t xml:space="preserve">Pip’le birlikte karanlıkta eve yürüdük ve daha önce tam olarak bilmediğim iki şeyi anladım. Cemiyet gerçekten batıyordu; sebep de işte buydu, önümde, teneke kovaya damla damla dökülerek tüm çıplaklığıyla duruyordu. Ve Theo hakkında ne yaparsam yapayım, bunu nazikçe yapmam gerekecekti, çünkü yağmur ona zaten yeterince zarar vermişti.</w:t>
       </w:r>
     </w:p>
     <w:p>
@@ -2689,7 +2689,7 @@
     <w:p/>
     <w:p>
       <w:r>
-        <w:t xml:space="preserve">Sam'in yirmi dolarıyla oturduğum gibi bununla da oturdum. Karşımda borca batmış, dünyadaki her türlü geçerli nedene ve bunun ötesinde her türlü fırsata sahip bir adam duruyordu. Bu duruma cevabı, bütün gece bir ücret karşılığında kasabanın festivalini korumak ve sabahın köründe büyükannelere öne hamle hareketi yaptırmak oluyordu. Jamal, çukurundan çıkmak için dürüst, yorucu, adım adım bir yolla üç işte birden çalışıyordu ve bu durum yarım milyon dolarlık bir şantaj notuyla uyuşmuyordu. Aritmetik tutmuyordu. Jamal Washington'ın bir sırdan o tür parayı bir şekilde elde etme ihtimali olsaydı, alarmını saat beşe kurmazdı.</w:t>
+        <w:t xml:space="preserve">Sam'in yirmi dolarını kafamda tarttığım gibi bunu da tarttım. Karşımda borca batmış, dünyadaki her türlü geçerli nedene ve bunun ötesinde her türlü fırsata sahip bir adam duruyordu. Bu duruma cevabı, bütün gece bir ücret karşılığında kasabanın festivalini korumak ve sabahın köründe büyükannelere öne hamle hareketi yaptırmak oluyordu. Jamal, çukurundan çıkmak için dürüst, yorucu, adım adım bir yolla üç işte birden çalışıyordu ve bu durum yarım milyon dolarlık bir şantaj notuyla uyuşmuyordu. Aritmetik tutmuyordu. Jamal Washington'ın bir sırdan o tür parayı bir şekilde elde etme ihtimali olsaydı, alarmını saat beşe kurmazdı.</w:t>
       </w:r>
     </w:p>
     <w:p/>
@@ -2722,7 +2722,7 @@
     <w:p/>
     <w:p>
       <w:r>
-        <w:t xml:space="preserve">Bunu hafifçe, bana herhangi bir şey verdiğinin farkında olmadan söyledi ve ben içimde çıkardığı küçük, temiz tıkırtı karşısında yüzümü sakin tuttum. Mektupları okumamıştı. Kutuları gözleri ayaklarında taşımıştı. Şantajcı Blackburn evraklarında ne okuduysa —broşu, taşı, rehinciyi— Jamal onu asla gözünün önüne getirmemişti. Onu kollarında, bir kutuya kilitlenmiş halde tutmuş ve asla içine bakmamıştı.</w:t>
+        <w:t xml:space="preserve">Bunu hafifçe, bana herhangi bir şey verdiğinin farkında olmadan söyledi ve ben içimde çıkardığı küçük, temiz tıkırtı karşısında yüzümü sakin tuttum. Mektupları okumamıştı. Kutuları gözleri ayaklarında taşımıştı. Şantajcı Blackburn evraklarında ne okuduysa —broşu, taşı, rehinciyi— Jamal'ın gözlerinin önünde hiç olmamıştı. Onu kollarında, bir kutuya kilitlenmiş halde tutmuş ve asla içine bakmamıştı.</w:t>
       </w:r>
     </w:p>
     <w:p/>
@@ -2779,7 +2779,7 @@
     </w:p>
     <w:p>
       <w:r>
-        <w:t xml:space="preserve">Greta, The Holly Jolly Bakery’nin tezgahında büyük camdan bir kar küresi tutardı; içinde meydanı ve Belediye Binası'yla birlikte küçük, seramik bir Frost Falls bulunan turistik bir şeydi. O sabah, Nick'in tarçınlı çöreklerini almak için uğradığımda, içindeki kar bir türlü durulmuyordu. Kimse dokunmadığı halde dönüyor da dönüyor, camın arkasında minik bir tipiye dönüşerek fırıl fırıl dönüyordu sanki. Greta, işe yarayacakmış gibi kürenin yarısının üzerine bir mutfak havlusu örtmüş, çöreklerini, kar küresini tartışmamaya karar vermiş bir kadının kararlı neşesiyle onun yanında satıyordu.</w:t>
+        <w:t xml:space="preserve">Greta, Holly Jolly Bakery’nin tezgahında büyük camdan bir kar küresi tutardı; içinde meydanı ve Belediye Binası'yla birlikte küçük, seramik bir Frost Falls bulunan turistik bir şeydi. O sabah, Nick'in tarçınlı çöreklerini almak için uğradığımda, içindeki kar bir türlü durulmuyordu. Kimse dokunmadığı halde dönüyor da dönüyor, camın arkasında minik bir tipiye dönüşerek fırıl fırıl dönüyordu sanki. Greta, işe yarayacakmış gibi kürenin yarısının üzerine bir mutfak havlusu örtmüş, çöreklerini, kar küresini tartışmamaya karar vermiş bir kadının kararlı neşesiyle onun yanında satıyordu.</w:t>
       </w:r>
     </w:p>
     <w:p>
@@ -2895,7 +2895,7 @@
     </w:p>
     <w:p>
       <w:r>
-        <w:t xml:space="preserve">— Parlak olduğunu biliyor, dedim ben. Tek bildiği bu.</w:t>
+        <w:t xml:space="preserve">— Parlak olduğunu biliyor, dedim ben. Ona bu kadarı yeter.</w:t>
       </w:r>
     </w:p>
     <w:p>
@@ -2935,7 +2935,7 @@
     </w:p>
     <w:p>
       <w:r>
-        <w:t xml:space="preserve">— Cemiyetten söz etmişken, dedi Ivy, kütüphanedeki o adamla karşılaşan başka kimse oldu mu?</w:t>
+        <w:t xml:space="preserve">— Cemiyet’ten söz etmişken, dedi Ivy, kütüphanedeki o adamla karşılaşan başka kimse oldu mu?</w:t>
       </w:r>
     </w:p>
     <w:p>
@@ -2945,7 +2945,7 @@
     </w:p>
     <w:p>
       <w:r>
-        <w:t xml:space="preserve">— Beni bankanın önünde durdurdu. Büyükannemin herhangi bir eski mücevheri olup olmadığını ve bunların arasında Blackburnlerden kalma bir parça bulunup bulunmadığını öğrenmek istedi. — Ivy başını salladı. — Büyükannemin kilise kermesinden kalma tek bir kameosu vardı. Ona ne isterse yapabileceğini söyledim.</w:t>
+        <w:t xml:space="preserve">— Beni bankanın önünde durdurdu. Büyükannemin herhangi bir eski mücevheri olup olmadığını ve bunların arasında Blackburnlerden kalma bir parça bulunup bulunmadığını öğrenmek istedi. — Ivy başını salladı. — Büyükannemin kilise kermesinden kalma tek bir kameosu vardı. Ona, isterse kameoyu alabileceğini söyledim.</w:t>
       </w:r>
     </w:p>
     <w:p>
@@ -3272,7 +3272,7 @@
     <w:p/>
     <w:p>
       <w:r>
-        <w:t xml:space="preserve">İkisini de yapacağıma söz verdim ve onu konsollarıyla baş başa bıraktım. Pip vidalardan biraz gönülsüzce vazgeçti ve o parıl parıl soğuk sokakta birlikte geri yürüdük. Hanla köşebaşı arasında bir yerde Sam Patel'in adını kafamdaki listeden sildim ve buna sevindim. Bir isim daha eksilmişti. Kapıdan içeri girmeme izin verdiğim anda Fiona'nın etrafındaki duvarın çatlağı olmaktan çıkıp onun bir başka taşına dönüşen bir iyi adam daha.</w:t>
+        <w:t xml:space="preserve">İkisini de yapacağıma söz verdim ve onu konsollarıyla baş başa bıraktım. Pip vidalardan biraz gönülsüzce vazgeçti ve o parıl parıl soğuk sokakta birlikte geri yürüdük. Hanla köşebaşı arasında bir yerde Sam Patel'in adını kafamdaki listeden sildim ve buna sevindim. Bir isim daha eksilmişti. Onu da işin içine aldığım anda Fiona'nın etrafındaki duvarın çatlağı olmaktan çıkıp onun bir başka taşına dönüşen bir iyi adam daha.</w:t>
       </w:r>
     </w:p>
     <w:p/>
@@ -3294,7 +3294,7 @@
     </w:p>
     <w:p>
       <w:r>
-        <w:t xml:space="preserve">— Gerçekten köklü bir büro, dedi ben daha "alo" diyemeden. — İki eyalet ötede eski bir yer; senin adamın ne diyorsa onu yapıyor; miras hukuku, mülkler ve daha çok parası olup da zamanı olmayan avukatlar için kayıp mülklerin peşine düşme işleri. Ve bir de Blackburn terekesi var, Jessica, gerçeği, güncel olanı. Adelaide Blackburn soyunun son temsilcisi bu baharda şehirde öldü, çocuğu yok, kayda değer bir vasiyeti yok ve ortada kocaman bir düğüm bırakmış. Bizim belediye başkanı kuzenler tarafından, yani burun alıp para alamayan taraftan. Onun bu işle ilgisi yok. Carter ise büronun defterlerinde, olayı çözmek için tuttukları araştırmacı olarak geçiyor. Bunu, hiçbir şey doğruladığının farkına varmadan her şeyi onaylayan bir kâtipten öğrendim. Adam sana tam olarak ne söylediyse o. Ruhsatlı ve masraf defteri olan bir dedektif.</w:t>
+        <w:t xml:space="preserve">— Gerçekten köklü bir büro, dedi ben daha "alo" diyemeden. İki eyalet ötede eski bir yer; bahsettiğin adam ne diyorsa onu yapıyor; miras hukuku, mülkler ve daha çok parası olup da zamanı olmayan avukatlar için kayıp mülklerin peşine düşme işleri. Ve bir de Blackburn terekesi var, Jessica, gerçeği, güncel olanı. Adelaide Blackburn soyunun son temsilcisi bu baharda şehirde öldü, çocuğu yok, kayda değer bir vasiyeti yok ve ortada kocaman bir düğüm bırakmış. Bizim belediye başkanı kuzenler tarafından, yani burun alıp para alamayan taraftan. Onun bu işle ilgisi yok. Carter ise büronun defterlerinde, olayı çözmek için tuttukları araştırmacı olarak geçiyor. Bunu, hiçbir şey doğruladığının farkına varmadan her şeyi onaylayan bir kâtipten öğrendim. Adam sana tam olarak ne söylediyse o. Ruhsatlı ve masraf defteri olan bir dedektif.</w:t>
       </w:r>
     </w:p>
     <w:p/>
@@ -3305,7 +3305,7 @@
     </w:p>
     <w:p>
       <w:r>
-        <w:t>— Bay Carter, dedim. — Size bir şey söyleyeceğim ve bunu söylerken yüzünüze bakacağım; umarım ikisini de yapmama izin verirsiniz.</w:t>
+        <w:t>— Bay Carter, dedim. Size bir şey söyleyeceğim ve bunu söylerken yüzünüze bakacağım; umarım ikisini de yapmama izin verirsiniz.</w:t>
       </w:r>
     </w:p>
     <w:p>
@@ -3320,7 +3320,7 @@
     </w:p>
     <w:p>
       <w:r>
-        <w:t>— Bir arkadaşım şantaja uğruyor, dedim. — Sizin broşunuz yüzünden. 1924’te nereye gittiği, onu kimin aldığı ve getirdiği parayla ne satın alındığı yüzünden. Birileri, elinde olmayan ve on yılda bile bir araya getiremeyeceği yarım milyon doları ödemediği takdirde bu hikâyeyle onun ailesini mahvetmekle tehdit ediyor.</w:t>
+        <w:t>— Bir arkadaşım şantaja uğruyor, dedim. Sizin broşunuz yüzünden. 1924’te nereye gittiği, onu kimin aldığı ve getirdiği parayla ne satın alındığı yüzünden. Birileri, elinde olmayan ve on yılda bile bir araya getiremeyeceği yarım milyon doları ödemediği takdirde bu hikâyeyle onun ailesini mahvetmekle tehdit ediyor.</w:t>
       </w:r>
     </w:p>
     <w:p/>
@@ -3358,7 +3358,7 @@
     </w:p>
     <w:p>
       <w:r>
-        <w:t xml:space="preserve">— Ona borçlu kalmışlardı, dedi Neil, okumamı izlerken. — Dedikodunun her zaman dışarıda bıraktığı kısım bu, çünkü dedikodu tertemiz küçük bir hain ve tertemiz küçük bir suç ister. O yirmi dört yılının kışında Blackburnler aylar boyunca ev halkının maaşını ödememişlerdi. Şikâyetler orada, işi bırakan diğer hizmetçiler ve bir mektup da var Bayan Claus, Constance’ın bizzat kendi yazdığı, birikmiş maaşını çok kibarca isteyen ama karşılığında başını sokacak bir çatıya sahip olduğu için şükretmesi gerektiği söylenen bir mektup. Aynı kış, üç sokak ötede annesi ölmekteydi ve bir doktor için hiç ama hiç para yoktu. Ve o kadın, üç ömürde kazanabileceğinden daha değerli bir broşun tozunu gün boyu alırken, ona sahip olan aile kendisine şükretmesini söylüyordu. — Ellerini iki yana açtı. — Onu almakta haklıydı demiyorum. Notun arkadaşınızın inanmasını istediği şekilde basit bir hırsız olmadığını söylüyorum. O, kendisine pekâlâ para ödeyebilecekken ödememeyi seçen zenginler tarafından ilk önce soyulmuş umutsuz bir kızdı. Alacağını, uzanabildiği tek şeyle kendisi aldı ve bunun üzerine yüz yıllık dürüst bir konukseverlik inşa etti. Bir han için bundan daha kötü temeller de vardır.</w:t>
+        <w:t xml:space="preserve">— Ona borçlu kalmışlardı, dedi Neil, okumamı izlerken. Dedikodunun her zaman dışarıda bıraktığı kısım bu, çünkü dedikodu tertemiz küçük bir kötü adam ve tertemiz küçük bir suç ister. O yirmi dört yılının kışında Blackburnler aylar boyunca ev halkının maaşını ödememişlerdi. Şikâyetler orada, işi bırakan diğer hizmetçiler ve bir mektup da var Bayan Claus, Constance’ın bizzat kendi yazdığı, birikmiş maaşını çok kibarca isteyen ama karşılığında başını sokacak bir çatıya sahip olduğu için şükretmesi gerektiği söylenen bir mektup. Aynı kış, üç sokak ötede annesi ölmekteydi ve bir doktor için hiç ama hiç para yoktu. Ve o kadın, üç ömürde kazanabileceğinden daha değerli bir broşun tozunu gün boyu alırken, ona sahip olan aile kendisine şükretmesini söylüyordu. — Ellerini iki yana açtı. — Onu almakta haklıydı demiyorum. Notun arkadaşınızın inanmasını istediği şekilde basit bir hırsız olmadığını söylüyorum. O, kendisine pekâlâ para ödeyebilecekken ödememeyi seçen zenginler tarafından ilk önce soyulmuş umutsuz bir kızdı. Alacağını, uzanabildiği tek şeyle kendisi aldı ve bunun üzerine yüz yıllık dürüst bir konukseverlik inşa etti. Bir han için bundan daha kötü temeller de vardır.</w:t>
       </w:r>
     </w:p>
     <w:p/>
@@ -3396,7 +3396,7 @@
     <w:p/>
     <w:p>
       <w:r>
-        <w:t>Arşiv, sergi salonunun arkasındaki uzun arka odaydı; tabandan tavana banka kutularıyla doluydu ve Theo’nun açılışta bütün kasabaya itiraf ettiği gibi, muhteşem bir enkazdı. Beni orada, aynı çarpık kravatıyla, solgun ve minnettar bir halde karşıladı; odanın diğer ucunda çalışırken beni de çalışma masasında bir deste evrakı ayıklamam için görevlendirdi. Neredeyse bir saat boyunca, ikisi de düzeni seven ve bu düzeni kurmaktan bir şekilde huzur bulan iki insanın o yoldaşça sessizliği içinde çalıştık. Pip yanımdaki alçak kutu yığınının üzerine kurulmuş, tepsimdeki pirinç ataçları yakından izliyordu. O bir saat boyunca, buraya ne için geldiğimi neredeyse unutmama izin verdim.</w:t>
+        <w:t>Arşiv, sergi salonunun arkasındaki uzun arka odaydı; tabandan tavana arşiv kutularıyla doluydu ve Theo’nun açılışta bütün kasabaya itiraf ettiği gibi, muhteşem bir enkazdı. Beni orada, aynı çarpık kravatıyla, solgun ve minnettar bir halde karşıladı; odanın diğer ucunda çalışırken beni de çalışma masasında bir deste evrakı ayıklamam için görevlendirdi. Neredeyse bir saat boyunca, ikisi de düzeni seven ve bu düzeni kurmaktan bir şekilde huzur bulan iki insanın o yoldaşça sessizliği içinde çalıştık. Pip yanımdaki alçak kutu yığınının üzerine kurulmuş, tepsimdeki pirinç ataçları yakından izliyordu. O bir saat boyunca, buraya ne için geldiğimi neredeyse unutmama izin verdim.</w:t>
       </w:r>
     </w:p>
     <w:p/>
@@ -3510,7 +3510,7 @@
     <w:p/>
     <w:p>
       <w:r>
-        <w:t>Bunu sindirerek öylece oturdum. Bu doğruydu ve hiç yardımcı olmuyordu. Nick bunun yardımcı olmayacağını biliyordu ama yine de buna katlanmama izin verdi.</w:t>
+        <w:t>Bunu sindirerek öylece oturdum. Bu doğruydu ve hiç yardımcı olmuyordu. Nick bunun yardımcı olmayacağını biliyordu ama yine de onu benden esirgemedi.</w:t>
       </w:r>
     </w:p>
     <w:p/>
@@ -3599,13 +3599,13 @@
     <w:p/>
     <w:p>
       <w:r>
-        <w:t xml:space="preserve">Evergreen Caddesi’nden aşağıya inerken adamlar meydana seyyar masalar taşıyorlardı. Hanın veranda basamaklarını çıkarken, omuzunda kanvas bir çanta ve koltuğunun altında bir altlık olan Vera Reed basamaklardan iniyordu; sergide olduğu gibi soğuğa karşı çenesine kadar düğmelenmişti.</w:t>
-      </w:r>
-    </w:p>
-    <w:p/>
-    <w:p>
-      <w:r>
-        <w:t xml:space="preserve">— Park kartları, dedi ben sormadan ve altlığı kaldırdı. Han misafirleri için. Belediye başkanı öğleye kadar her arabanın ön camında bir tane olmasını istiyor.</w:t>
+        <w:t xml:space="preserve">Evergreen Caddesi’nden aşağıya inerken adamlar meydana seyyar masalar taşıyorlardı. Hanın veranda basamaklarını çıkarken, omuzunda kanvas bir çanta ve koltuğunun altında bir pano olan Vera Reed basamaklardan iniyordu; sergide olduğu gibi soğuğa karşı çenesine kadar düğmelenmişti.</w:t>
+      </w:r>
+    </w:p>
+    <w:p/>
+    <w:p>
+      <w:r>
+        <w:t xml:space="preserve">— Park kartları, dedi ben sormadan ve panoyu kaldırdı. Han misafirleri için. Belediye başkanı öğleye kadar her arabanın ön camında bir tane olmasını istiyor.</w:t>
       </w:r>
     </w:p>
     <w:p/>
@@ -3787,7 +3787,7 @@
     <w:p/>
     <w:p>
       <w:r>
-        <w:t xml:space="preserve">Birinci kulvarda oradaydım; kasabasının festivalindeki bir kasaba sakiniydim ve her şey muhteşemdi. Emma Redfern beni elma suyu standının orada buldu; babasının özenli eliyle tam yerlerine dikilmiş gümüş yıldızlarıyla siyah bir takım olan, bir gece önceden giymekte ısrar ettiği takımyıldızı kostümünü, Orion’u gösterdi. Her bir yıldızın adını söylememi istedi ve söyledim, çünkü o yıldızları çok uzun zamandır tanıyorum. Bayan Claus’un takımyıldızlarını bilmesi onu çok mutlu etmişti. Mark, iki bardak elma suyuyla ve kalabalığın ortasında sekiz yaşında olan kızını hayranlıkla izleyen bir adamın o huzurdan yumuşamış ifadesiyle yanında duruyordu. Martha masadan bana bir çift eldiven sıkıştırdı, o yeşil olanları, "şu soğuk ellerin için" diyerek. Sam Patel meydanın öte başından, hanın verandasından şapkasını kaldırdı; tam istediğim gibi bütün gün gözü hemen kapının içindeki resepsiyon masasında, o nöbet noktasındaydı.</w:t>
+        <w:t xml:space="preserve">Birinci kulvarda oradaydım; kasabasının festivalindeki bir kasaba sakiniydim ve her şey muhteşemdi. Emma Redfern beni elma suyu standının orada buldu; babasının özenli eliyle tam yerlerine dikilmiş gümüş yıldızlarıyla siyah bir takım olan, bir gece önceden giymekte ısrar ettiği takımyıldızı kostümünü, Orion’u gösterdi; kemer de tıpatıp doğru yerdeydi. Her bir yıldızın adını söylememi istedi ve söyledim, çünkü o yıldızları çok uzun zamandır tanıyorum. Bayan Claus’un takımyıldızlarını bilmesi onu çok mutlu etmişti. Mark, iki bardak elma suyuyla ve kalabalığın ortasında sekiz yaşında olan kızını hayranlıkla izleyen bir adamın o huzurdan yumuşamış ifadesiyle yanında duruyordu. Martha masadan bana bir çift eldiven sıkıştırdı, o yeşil olanları, "şu soğuk ellerin için" diyerek. Sam Patel meydanın öte başından, hanın verandasından şapkasını kaldırdı; tam istediğim gibi bütün gün gözü hemen kapının içindeki resepsiyon masasında, o nöbet noktasındaydı.</w:t>
       </w:r>
     </w:p>
     <w:p/>
@@ -3799,7 +3799,7 @@
     <w:p/>
     <w:p>
       <w:r>
-        <w:t xml:space="preserve">Öğleden sonra bir ara, her şeyin gerçeğe dönüştüğünü sandım. Bir silüet hanın verandasına süzüldü, açık kapının önünde duraksadı, etrafa şöyle bir göz gezdirdi ve resepsiyon masasına doğru uzandı. Kalbim durdu. Hızlıca meydanı aşmaya başladım ve Sam de zaten nöbet yerinden hareket etmişti. Sonra silüet arkasını döndü ve gelen, sadece misafirlerin görebileceği bir yığın üyelik broşürünü masaya bırakan Cemiyet yönetim kurulundan Bayan Pelletier’den başkası değildi. Sam’le ben zıt yönlerden, ikimiz de aceleyle aynı anda vardık ve broşürlerin üzerinden birbirimizin gözlerinin içine baktık. Bayan Pelletier ikimiz arasında şaşkınlıkla gidip geldi. İhtiyacım olmayan üç broşür aldım, Sam hava hakkında bir şeyler söyledi ve geri çekildik. Günün en çok yaklaşan anı buydu. Yanlış bir alarm. Ama keman müziğinin altında ne kadar gerildiğimi, sıcaklık ile korku arasındaki çizginin ne kadar ince olduğunu bana açıkça göstermişti.</w:t>
+        <w:t xml:space="preserve">Öğleden sonra bir ara, her şeyin gerçeğe dönüştüğünü sandım. Bir silüet hanın verandasına süzüldü, açık kapının önünde duraksadı, etrafa şöyle bir göz gezdirdi ve resepsiyon masasına doğru uzandı. Kalbim durdu. Hızlıca meydanı aşmaya başladım ve Sam de zaten nöbet yerinden hareket etmişti. Sonra silüet arkasını döndü ve gelen, misafirlerin görebileceği bir yere, masaya bir yığın üyelik broşürü bırakan Cemiyet yönetim kurulundan Bayan Pelletier’den başkası değildi. Sam’le ben zıt yönlerden, ikimiz de aceleyle aynı anda vardık ve broşürlerin üzerinden birbirimizin gözlerinin içine baktık. Bayan Pelletier ikimiz arasında şaşkınlıkla gidip geldi. İhtiyacım olmayan üç broşür aldım, Sam hava hakkında bir şeyler söyledi ve geri çekildik. Günün en çok yaklaşan anı buydu. Yanlış bir alarm. Ama keman müziğinin altında ne kadar gerildiğimi, sıcaklık ile korku arasındaki çizginin ne kadar ince olduğunu bana açıkça göstermişti.</w:t>
       </w:r>
     </w:p>
     <w:p/>
@@ -3919,7 +3919,7 @@
         <w:t xml:space="preserve">Kalbindeki safir:</w:t>
       </w:r>
       <w:r>
-        <w:t xml:space="preserve"> iki kelime, bir hırsıza değil bir tarihçiye ait bir üslup; şantaj notunda, Theo’nun o özenli, eğik el yazısıyla kartta durduğu gibi duruyordu. Not, Cemiyetin krem rengi antetli kağıdına yazılmıştı; sergideki ön masada yığılı dururken gördüğüm o kalın, dokulu kağıda. Arşivi yöneten adam batıyordu. Üç eyaletteki her dürüst kapıyı çalmış ve yüzlerine kapanmasını izlemişti. Bütün kasabanın önüne dikilip, broşü anlatan mektupların ortadan kaybolduğunu büyük bir teessüfle duyurmuştu.</w:t>
+        <w:t xml:space="preserve"> iki kelime, bir hırsıza değil bir tarihçiye ait bir üslup; şantaj notunda, Theo’nun o özenli, eğik el yazısıyla kartta durduğu gibi duruyordu. Not, Cemiyet’in krem rengi antetli kağıdına yazılmıştı; sergideki ön masada yığılı dururken gördüğüm o kalın, dokulu kağıda. Arşivi yöneten adam batıyordu. Üç eyaletteki her dürüst kapıyı çalmış ve yüzlerine kapanmasını izlemişti. Bütün kasabanın önüne dikilip, broşü anlatan mektupların ortadan kaybolduğunu büyük bir teessüfle duyurmuştu.</w:t>
       </w:r>
     </w:p>
     <w:p>
@@ -3929,7 +3929,7 @@
     </w:p>
     <w:p>
       <w:r>
-        <w:t xml:space="preserve">İkinci notu ve Cemiyetin kırtasiyesinden boş bir yaprak kağıdı elime aldım; yeni dosya etiketleri yazmam için Theo’nun arşivde bana verdiği ve çantamda eve taşıdığım kağıtlardan biriydi. İkisini lamba ışığında yan yana tuttum. Aynı krem rengi. Parmaklarda aynı ağırlık. Kağıdın hamuruna preslenmiş aynı silik çizgiler; kağıt yapımcısının eleğinin bıraktığı, bir yaprağı ışığa tutup bakmayı biliyorsanız açıkça görülebilen ince paralel çıkıntılar. Biri diğeriyle örtüşüyordu. Tabii ki örtüşüyordu. Not, Theo’nun zulasından çıkan kağıda yazılmıştı; günlerdir terk etmediği binanın ön masasındaki yığınından.</w:t>
+        <w:t xml:space="preserve">İkinci notu ve Cemiyet’in kırtasiyesinden boş bir yaprak kağıdı elime aldım; yeni dosya etiketleri yazmam için Theo’nun arşivde bana verdiği ve çantamda eve taşıdığım kağıtlardan biriydi. İkisini lamba ışığında yan yana tuttum. Aynı krem rengi. Parmaklarda aynı ağırlık. Kağıdın hamuruna preslenmiş aynı silik çizgiler; kağıt yapımcısının eleğinin bıraktığı, bir yaprağı ışığa tutup bakmayı biliyorsanız açıkça görülebilen ince paralel çıkıntılar. Biri diğeriyle örtüşüyordu. Tabii ki örtüşüyordu. Not, Theo’nun zulasından çıkan kağıda yazılmıştı; günlerdir terk etmediği binanın ön masasındaki yığınından.</w:t>
       </w:r>
     </w:p>
     <w:p>
@@ -3968,7 +3968,7 @@
     </w:p>
     <w:p>
       <w:r>
-        <w:t xml:space="preserve">Lamba ışığında kıpırtısız oturdum. Broşün hırsızlığı ve hanın satın alınışı iki ayrı sırdı, iki farklı binada tutuluyordu. Theo bunlardan birine sahipti. Arşivi, mektupları, katalog kartını, kırtasiyeyi o elinde tutuyordu. Hırsızlık ondaydı. Ama çalınan paranın bu çok sevilen hana dönüştüğünün kanıtı belediye binasındaydı; kaskatı, yorgun bir kadının gözlerimin içine bakıp o kayıtları asla okumadığına yemin ettiği mülk kayıtlarındaydı.</w:t>
+        <w:t xml:space="preserve">Lamba ışığında kıpırtısız oturdum. Broşün hırsızlığı ve hanın satın alınışı iki ayrı sırdı, iki farklı binada tutuluyordu. Theo bunlardan birine sahipti. Arşivi, mektupları, katalog kartını, kırtasiyeyi o elinde tutuyordu. Hırsızlığın bilgisi ondaydı. Ama çalınan paranın bu çok sevilen hana dönüştüğünün kanıtı belediye binasındaydı; kaskatı, yorgun bir kadının gözlerimin içine bakıp o kayıtları asla okumadığına yemin ettiği mülk kayıtlarındaydı.</w:t>
       </w:r>
     </w:p>
     <w:p>
@@ -4106,7 +4106,7 @@
     <w:p/>
     <w:p>
       <w:r>
-        <w:t>İkisi de elimdeydi. Bunca endişeden sonra bunun bir zafer gibi hissettirmesi gerekirdi; oysa üzerimden yürümek istemediğim uzun bir yokuşun tepesinde duruyormuşum gibi hissettiriyordu. Bu yokuşun dibinde tanıdığım ve sevdiğim iki insan, aralarında sıkıştırıp durdukları bir dost ve kendi insanlarından ikisi hakkında çirkin şeyler öğrenmek zorunda kalabilecek sıcacık bir kasaba vardı.</w:t>
+        <w:t>İkisi de elimdeydi. Bunca endişeden sonra bunun bir zafer gibi hissettirmesi gerekirdi; oysa aşağı inmek istemediğim uzun bir yokuşun tepesinde duruyormuşum gibi hissettiriyordu. Bu yokuşun dibinde tanıdığım ve sevdiğim iki insan, aralarında sıkıştırıp durdukları bir dost ve kendi insanlarından ikisi hakkında çirkin şeyler öğrenmek zorunda kalabilecek sıcacık bir kasaba vardı.</w:t>
       </w:r>
     </w:p>
     <w:p/>
@@ -4164,7 +4164,7 @@
     <w:p/>
     <w:p>
       <w:r>
-        <w:t xml:space="preserve">Karanlıkta söylenecek sessiz bir söz, en çok korunması gereken kişi hariç herkesi korurdu. Fiona'yı özgürleştirmezdi. Sadece sırrının kimin ellerinde olduğunu değiştirirdi. Şu an bir şantajcı bunu elinde tutuyordu. Benim sessiz merhametimden sonra, ben tutacaktım. Nick de tutacaktı; affedilmiş ve serbest kalmış, o tavan arası sandığını nasıl bir servete dönüştüreceğini dünyada çok iyi bilen o iki kişi, Theo ile Vera da tutacaktı. Fiona, komşularından ikisinin bir zamanlar kendisinden fidye koparmaya çalıştığını, bundan sıyrıldığını ve yıllar boyunca herhangi kötü bir gecede, herhangi umutsuz bir kışta tekrar deneyebileceklerini bilerek ömrünün geri kalanını geçirirdi. Korku bitmezdi. Sadece sessizleşirdi. Kutup'ta on bin mektup okumuştum ve içlerindeki acı çoğunlukla karanlıkta tek başına taşınan bir sırdı.</w:t>
+        <w:t xml:space="preserve">Karanlıkta söylenecek sessiz bir söz, en çok korunması gereken kişi hariç herkesi korurdu. Fiona'yı özgürleştirmezdi. Sadece sırrının kimin ellerinde olduğunu değiştirirdi. Şu an bir şantajcı bunu elinde tutuyordu. Benim sessiz merhametimden sonra, ben tutacaktım. Nick de tutacaktı; affedilmiş ve serbest kalmış, o tavan arası sandığını nasıl bir servete dönüştüreceğini dünyada çok iyi bilen o iki kişi, Theo ile Vera da tutacaktı. Fiona, komşularından ikisinin bir zamanlar kendisinden fidye koparmaya çalıştıklarını, bundan paçayı sıyırdıklarını ve yıllar boyunca herhangi kötü bir gecede, herhangi umutsuz bir kışta tekrar deneyebileceklerini bilerek ömrünün geri kalanını geçirirdi. Korku bitmezdi. Sadece sessizleşirdi. Kutup'ta on bin mektup okumuştum ve içlerindeki acı çoğunlukla karanlıkta tek başına taşınan bir sırdı.</w:t>
       </w:r>
     </w:p>
     <w:p/>
@@ -4212,7 +4212,7 @@
     <w:p/>
     <w:p>
       <w:r>
-        <w:t xml:space="preserve">Bu korkuyla oturdum ve gerçek olmasına izin verdim. Sonra onu bıraktım, çünkü Martha çemberde elini dizimin üzerine koyarak bunu çoktan yanıtlamıştı. Her ne taşıyorsan sırtında, tek başına taşımak zorunda değilsin. Çemberin bütün esprisi bu zaten. Bir yeri, onun adına zor ve doğru şeyi yapacak kadar çok sevebilirdim ve öteki tarafta hâlâ benimki olarak kalacağına güvenebilirdim.</w:t>
+        <w:t xml:space="preserve">Bu korkuyu bir süre içimde tuttum ve gerçek olmasına izin verdim. Sonra onu bıraktım, çünkü Martha çemberde elini dizimin üzerine koyarak bunu çoktan yanıtlamıştı. Her ne taşıyorsan sırtında, tek başına taşımak zorunda değilsin. Çemberin bütün esprisi bu zaten. Bir yeri, onun adına zor ve doğru şeyi yapacak kadar çok sevebilirdim ve öteki tarafta hâlâ benimki olarak kalacağına güvenebilirdim.</w:t>
       </w:r>
     </w:p>
     <w:p/>
@@ -4283,7 +4283,7 @@
     <w:p/>
     <w:p>
       <w:r>
-        <w:t xml:space="preserve">— Bir yolu var, dedi. İşin içindekiler canavar değilse hemen her zaman bir yol vardır ve bana anlattıklarına bakılırsa bu ikisi canavar değil. Bunlar, iyi olduğuna kendilerini yarıdan fazla inandırdıkları sebeplerle kötü bir şey yapmış çaresiz bir adamla korkmuş bir kadın. — Kalemi masaya bıraktı. — Yapmayacağım şey şu: Kapıyı tekmeleyip kırıvererek festivalin ortasında, bütün kasabanın gözü önünde Theo Hussein'e kelepçe takmayacağım. Bunun kimseye faydası yok, gerekli de değil; daha merhametli bir şey işe yarayacakken bu kadar zalimce bir şey yapmam. — Masanın üzerinden kararlı bir bakışla bana baktı. — Yapacağım şey şu: Yasal ve kayıt altında olması için, ben de odadayken bunu üstlenme şansını ona vereceğim. Eğer bunu mertçe kabul eder, tazminat ve gerçek bir hesaplaşmayla telafi ederse, işin sonunda bu meselenin yıkımdan başka bir şeyle bitme ihtimali var. Biz buna onarıcı adalet diyoruz. Geriye kalanı sadece kırmak yerine, kurtarılabilecek olanı onarır. Ama bu yalnızca gerçekse işe yarar, Jessica. Eğer yalan söylerse ya da yan kapıdan sıvışmaya çalışırsa, iş zor yoldan yürür ve bu benim ya da senin değil, onun seçimi olur.</w:t>
+        <w:t xml:space="preserve">— Bir yolu var, dedi. İşin içindekiler canavar değilse hemen her zaman bir yol vardır ve bana anlattıklarına bakılırsa bu ikisi canavar değil. Bunlar, iyi olduğuna kendilerini yarıdan fazla inandırdıkları sebeplerle kötü bir şey yapmış çaresiz bir adamla korkmuş bir kadın. — Kalemi masaya bıraktı. — Yapmayacağım şey şu: Kapıyı tekmeleyip kırıvererek festivalin ortasında, bütün kasabanın gözü önünde Theo Hussein'e kelepçe takmayacağım. Bunun kimseye faydası yok, gerekli de değil; daha merhametli bir şey işe yarayacakken bu kadar zalimce bir şey yapmam. — Masanın üzerinden kararlı bir bakışla bana baktı. — Yapacağım şey şu: Yasal ve kayıt altında olması için, ben de odadayken bunu üstlenme şansını ona vereceğim. Eğer bunu kendi isteğiyle kabul eder, tazminat ve gerçek bir hesaplaşmayla telafi ederse, işin sonunda bu meselenin yıkımdan başka bir şeyle bitme ihtimali var. Biz buna onarıcı adalet diyoruz. Geriye kalanı sadece kırmak yerine, kurtarılabilecek olanı onarır. Ama bu yalnızca gerçekse işe yarar, Jessica. Eğer yalan söylerse ya da yan kapıdan sıvışmaya çalışırsa, iş zor yoldan yürür ve bu benim ya da senin değil, onun seçimi olur.</w:t>
       </w:r>
     </w:p>
     <w:p/>
@@ -4295,7 +4295,7 @@
     <w:p/>
     <w:p>
       <w:r>
-        <w:t xml:space="preserve">— Öyleyse bunu şöyle yapacağız. — Defteri kapattı. — Baskın yok. İşaretli para yok, karanlıkta hanın merdivenlerinin altına sokuşturulmuş sahte zarf yok. Bunlar televizyonda olur. Sıradan insanları hiçbir geçerli sebep yokken tehlikeye atar. Onlarla oturup konuşacağız. Sen, ben ve eğer isterse Fiona. Bildiklerimizi açıkça ortaya koyacağız, tıpkı biraz önce bana anlattığın gibi, ve bu kasabanın her zaman ne olduğuna inandığı o insanlar olma şansını onlara vereceğiz. Çoğu insan, hakikat kibarca ve bütün halinde önüne serildiğinde o şansı kullanır. Bunu sırtlarında taşımaktan yorulmuşlardır. Birçoğu, korkunun gerisinde, bunu yere bırakmaktan içten içe memnun bile olur.</w:t>
+        <w:t xml:space="preserve">— Öyleyse bunu şöyle yapacağız. — Defteri kapattı. — Tuzak operasyonu yok. İşaretli para yok, karanlıkta hanın merdivenlerinin altına sokuşturulmuş sahte zarf yok. Bunlar televizyonda olur. Sıradan insanları hiçbir geçerli sebep yokken tehlikeye atar. Onlarla oturup konuşacağız. Sen, ben ve eğer isterse Fiona. Bildiklerimizi açıkça ortaya koyacağız, tıpkı biraz önce bana anlattığın gibi, ve bu kasabanın her zaman ne olduğuna inandığı o insanlar olma şansını onlara vereceğiz. Çoğu insan, hakikat kibarca ve bütün halinde önüne serildiğinde o şansı kullanır. Bunu sırtlarında taşımaktan yorulmuşlardır. Birçoğu, korkunun gerisinde, bunu yere bırakmaktan içten içe memnun bile olur.</w:t>
       </w:r>
     </w:p>
     <w:p/>
@@ -4535,7 +4535,7 @@
     </w:p>
     <w:p>
       <w:r>
-        <w:t xml:space="preserve">— Tam da hak ettiğin şey, dedi Fiona ona, ve bu nezaketin içinde çelik gibi bir kararlılık vardı. Yani bunu en başta asla yapmayacak bir adama dönüşme şansı. Herkesin sana sarıldığı ve her şeyin yılbaşına kadar unutulduğu o kolay versiyonu alamıyorsun, Theo. Gerçek olanı alıyorsun. Yıllar boyunca bunu yeniden kazanmak ve her yılını iliklerine kadar hissetmek zorundasın. Sana zulmetmiyorum. Bunu yapabileceğine inanıyorum. Yürüyemeyeceğini düşünseydim sana bir yol inşa etmekle uğraşmazdım.</w:t>
+        <w:t xml:space="preserve">— Tam da hak ettiğin şey, dedi Fiona ona, ve bu nezaketin içinde çelik gibi bir kararlılık vardı. Yani bunu en başta asla yapmayacak bir adama dönüşme şansı. Herkesin sana sarıldığı ve her şeyin Noel’e kadar unutulduğu o kolay versiyonu alamıyorsun, Theo. Gerçek olanı alıyorsun. Yıllar boyunca bunu yeniden kazanmak ve her yılını iliklerine kadar hissetmek zorundasın. Sana zulmetmiyorum. Bunu yapabileceğine inanıyorum. Yürüyemeyeceğini düşünseydim sana bir yol inşa etmekle uğraşmazdım.</w:t>
       </w:r>
     </w:p>
     <w:p>
@@ -4555,7 +4555,7 @@
     </w:p>
     <w:p>
       <w:r>
-        <w:t xml:space="preserve">Ağladı. Bana sarıldı; ömrümde kimseye sarıldığını görmediğim bu sert, düğmeli kadın omzuma yaslanıp teşekkür etti. Sonra kız kardeşinin evine doğru arabasını sürdü ve Pip’le birlikte erken kararan havada eve yürüdük. Ortada hiçbir zafer havası yoktu. İçi boşalmış, baştan sona yorgundum; sanki bir yarayı dibine kadar temizlemiştim: kendi haline bırakmaktan çok daha fazla acıtmıştı ama artık iyileşebilirdi.</w:t>
+        <w:t xml:space="preserve">Ağladı. Bana sarıldı; ömrümde kimseye sarıldığını görmediğim bu sert, düğmeli kadın omzuma yaslanıp teşekkür etti. Sonra kız kardeşinin evine doğru arabasını sürdü ve Pip’le birlikte erken kararan havada eve yürüdük. Ortada hiçbir zafer havası yoktu. İçim ağırlaşmıştı, baştan sona yorgundum; sanki bir yarayı dibine kadar temizlemiştim: kendi haline bırakmaktan çok daha fazla acıtmıştı ama artık iyileşebilirdi.</w:t>
       </w:r>
     </w:p>
     <w:p>
@@ -4694,7 +4694,7 @@
     <w:p/>
     <w:p>
       <w:r>
-        <w:t xml:space="preserve">Fiona'nın, neredeyse onu mahvedecek olan bu sırrı, her zamankinden de derinlere gömmek isteyeceğini sanmıştım. Daha iyi bilmem gerekirdi. Oysa o, bu süreçte gördüğüm en cesurca şeyi yaptı; küçük oturma odasında Theo'nun karşısına dikilmekten bile daha cesurca. Sırrı açıklamaya karar verdi.</w:t>
+        <w:t xml:space="preserve">Fiona'nın, onu neredeyse mahvetmiş olan bu sırrı, her zamankinden de derinlere gömmek isteyeceğini sanmıştım. Daha iyi bilmem gerekirdi. Oysa o, bu süreçte gördüğüm en cesurca şeyi yaptı; küçük oturma odasında Theo'nun karşısına dikilmekten bile daha cesurca. Sırrı açıklamaya karar verdi.</w:t>
       </w:r>
     </w:p>
     <w:p/>
@@ -4840,7 +4840,7 @@
     <w:p/>
     <w:p>
       <w:r>
-        <w:t xml:space="preserve">Çukuru Sam Patel kazdı; çünkü Sam ağır, dürüst işleri severdi ve yapmaktan hoşlanırdı. Fenerlerin ve ipe dizilmiş ışıkların altın sarısı parıltısı altında, soğuk havada soluklarımız birlikte tüterek onun etrafında halka olmuştuk. Bir tarafımda Emma Redfern elimi tutuyor, diğer tarafımda Pip sıcacık bir şekilde çizmeme yaslanıyordu. Snowball geyik boynuzlu şapkasını takmıştı. Mark, ellerini kızının omuzlarına koymuş, arkasında duruyordu. Bütün çember oradaydı; planladığından daha uzun süre kalan ve o gece defteri ilk kez cebine atıp arkada duran Neil Carter da onlardaydı. Sam’in küreği tok, sağlam ve metalik bir sese çarptığında, bütün meydan soğuk havada asılı kalan yumuşak, şaşkın bir </w:t>
+        <w:t xml:space="preserve">Çukuru Sam Patel kazdı; çünkü ağır, dürüst işleri hep Sam yapardı ve bundan hoşlanırdı. Fenerlerin ve ipe dizilmiş ışıkların altın sarısı parıltısı altında, soğuk havada soluklarımız birlikte tüterek onun etrafında halka olmuştuk. Bir tarafımda Emma Redfern elimi tutuyor, diğer tarafımda Pip sıcacık bir şekilde çizmeme yaslanıyordu. Snowball geyik boynuzlu şapkasını takmıştı. Mark, ellerini kızının omuzlarına koymuş, arkasında duruyordu. Bütün çember oradaydı; planladığından daha uzun süre kalan ve o gece defteri ilk kez cebine atıp arkada duran Neil Carter da onlardaydı. Sam’in küreği tok, sağlam ve metalik bir sese çarptığında, bütün meydan soğuk havada asılı kalan yumuşak, şaşkın bir </w:t>
       </w:r>
       <w:r>
         <w:rPr>
@@ -4897,7 +4897,7 @@
     <w:p/>
     <w:p>
       <w:r>
-        <w:t xml:space="preserve">— Mandalı, Bayan Claus! diye seslendi Bram nefes nefese vararak. Yine yanlış tarafından! Pes ediyorum, bütün bu işten vazgeçiyorum, hayvanlar insanların olduğu yere geliyor ve kasabadaki herkes bu gece burada, bir kalfa bununla ne yapabilir, sana soruyorum!</w:t>
+        <w:t xml:space="preserve">— Mandal, Bayan Claus! diye seslendi Bram nefes nefese vararak. Yine yanlış tarafından! Pes ediyorum, bütün bu işten vazgeçiyorum, hayvanlar insanların olduğu yere geliyor ve kasabadaki herkes bu gece burada, bir kalfa bununla ne yapabilir, sana soruyorum!</w:t>
       </w:r>
     </w:p>
     <w:p/>
@@ -4980,7 +4980,7 @@
     <w:p/>
     <w:p>
       <w:r>
-        <w:t xml:space="preserve">Redfernlerin kapısına vardığımızda Emma, Snowball’un tasmasını elime tutuşturdu. — Bekle, dedi. Gitme. — İçeri koştu ve iki eliyle kavradığı bir reçel kavanozuyla geri döndü.</w:t>
+        <w:t xml:space="preserve">Redfernlerin kapısına vardığımızda Emma, Snowball’un tasmasını elime tutuşturdu. — Bekleyin, dedi. Gitmeyin. — İçeri koştu ve iki eliyle kavradığı bir reçel kavanozuyla geri döndü.</w:t>
       </w:r>
     </w:p>
     <w:p/>
@@ -4992,7 +4992,7 @@
     <w:p/>
     <w:p>
       <w:r>
-        <w:t xml:space="preserve">— Hiç solmadı bile, diye fısıldadı; çitlerin arkasında bir komşuyla konuşmak için durmuş olan babasına bir göz atarak. — Her sabah suyunu değiştiriyorum. Babam onu hanın çelenginden kopardığımı zannediyor.</w:t>
+        <w:t xml:space="preserve">— Hiç solmadı bile, diye fısıldadı; çitlerin arkasında bir komşuyla konuşmak için durmuş olan babasına bir göz atarak. Her sabah suyunu değiştiriyorum. Babam onu hanın çelenginden kopardığımı zannediyor.</w:t>
       </w:r>
     </w:p>
     <w:p/>
@@ -5210,7 +5210,7 @@
     <w:p/>
     <w:p>
       <w:r>
-        <w:t xml:space="preserve">Çemberdeki her kadın kendi köknar dalını getirmişti; bense Kuzey Kutbu’nun bunları bağlama yöntemini getirmiştim. Olivia da Noel’den önce bunu benden çalacağına yemin etmişti. Teli iskelete yavaşça sardım ki herkes rahatça takip edebilsin. Ancak o zaman ilk bir avuç köknar dalına uzandım. Koku, kafayı açacak kadar keskin, yeşil ve soğuk bir şekilde yükseldi. Dükkânın kendi yünlerinin hiçbir zaman tam olarak başaramadığı bir şekilde Yarn Tales’ın ön odasını doldurdu. Parmaklarım reçineli, kucağımda çıplak bir iskeletle, aynı işe eğilmiş yedi kadından biri olarak orada oturdum. Kasım ayının ilk boş sabahını geçirmenin daha kötü yolları da vardır.</w:t>
+        <w:t xml:space="preserve">Çemberdeki her kadın kendi köknar dalını getirmişti; bense Kuzey Kutbu’nun bunları bağlama yöntemini getirmiştim. Olivia da Noel’den önce bunu benden çalacağına yemin etmişti. Teli iskelete yavaşça sardım ki herkes rahatça takip edebilsin. Ancak o zaman ilk bir avuç köknar dalına uzandım. Koku, kafayı açacak kadar keskin, yeşil ve soğuk bir şekilde yükseldi. Dükkânın kendi yünlerinin hiçbir zaman tam olarak başaramadığı bir şekilde Yarn Tales’ın ön odasını doldurdu. Parmaklarım reçineli, kucağımda çıplak bir iskeletle, aynı işe eğilmiş yedi kadından biri olarak orada oturdum. kasım ayının ilk boş sabahını geçirmenin daha kötü yolları da vardır.</w:t>
       </w:r>
     </w:p>
     <w:p>
@@ -5220,12 +5220,12 @@
     </w:p>
     <w:p>
       <w:r>
-        <w:t xml:space="preserve">— Yavaş ol, dedi Olivia, yan sandalyeden eğilerek. — Göremediğim şeyi çalamam.</w:t>
-      </w:r>
-    </w:p>
-    <w:p>
-      <w:r>
-        <w:t xml:space="preserve">Onun için yavaşladım. Üç dalı iskelete yerleştirdim, iki tur telle bağladım ve bir sonraki demeti ilkinin üzerine, bağı gizleyecek şekilde koydum. — Her biri balık pulu gibi bir öncekinin üzerine gelir. Hepsi de aynı yöne bakar.</w:t>
+        <w:t xml:space="preserve">— Yavaş ol, dedi Olivia, yan sandalyeden eğilerek. Göremediğim şeyi çalamam.</w:t>
+      </w:r>
+    </w:p>
+    <w:p>
+      <w:r>
+        <w:t xml:space="preserve">Onun için yavaşladım. Üç dalı iskelete yerleştirdim, iki tur telle bağladım ve bir sonraki demeti ilkinin üzerine, bağı gizleyecek şekilde koydum. — Her biri balık pulu gibi bir öncekinin üzerine gelir. Hepsi de eve doğru bakar.</w:t>
       </w:r>
     </w:p>
     <w:p>
@@ -5255,12 +5255,12 @@
     </w:p>
     <w:p>
       <w:r>
-        <w:t xml:space="preserve">O sabah hepimiz oradaydık. Soğuğa yenik düşen ya da torun bakanlar hariç bütün çember oradaydı. Olivia, kendi dükkânının başköşesinde, bir kışın isteyebileceği her renkte üst üste yığılmış yün çilelerinin arasında oturuyordu. Hemen yanında sade ve çevik Dot vardı. Sonra, Gazette için yazan Claire Bennett; sandalyesinin kolçağında açık duran defteriyle, çünkü Claire hiçbir zaman tam anlamıyla mesai dışı sayılmazdı. Bir satır karalamak için çelengini sürekli elinden bırakıyor, sonra bizlerin bir adım gerisinden yeniden eline alıyordu. Hemen yanında Ivy; gülüşü öyle gür ve öyle hazırdı ki onun varlığı bile dükkânı daha aydınlık gösteriyordu. Farkında bile olmadan saçına köknar reçinesi bulaştırmıştı. Martha, emekli öğretmen; yıllardır dul, küçük beyaz köpeği Snowball ayak bileğine kıvrılmış uyuyordu. Ara sıra eli, köpeğin kulağına dokunmak için aşağı sarkıyordu. Hâlâ orada olduğundan emin olmak için. Ve Ellie; kibar ve acelecesiz, haftada üç gün hastanede gönüllü çalışıyordu. O sarsılmaz şefkati bir tel iskelete bile taşıyordu. Çelengi yapılmıştan ziyade adeta doğmuş gibi görünüyordu.</w:t>
-      </w:r>
-    </w:p>
-    <w:p>
-      <w:r>
-        <w:t xml:space="preserve">Ve Pip; çemberden biri değildi ama kimlerin hazır bulunduğunun sayımında dışarıda bırakılmaya şiddetle alınırdı. Ön pencerenin altına, Kasım ayının o alçak güneşinin vurduğu tek noktaya yerleşmişti; Olivia’nın fark ettiğim kadarıyla geri almak için pek de uğraşmadığı yere düşmüş kırmızı bir yün çilesinden yaptığı yuvaya kurulmuştu. Orada pırıl pırıl ve memnun bir şekilde uzanıyordu, tek gözü yarı aralık halde olan biteni kolluyordu. Özellikle de parıldayan her şeyi. Parıldayan çok şey de vardı doğrusu. Olivia’nın masasının üzerinde yaldızlı kozalaklardan oluşan bir kavanoz, yanında da bir makara altın kurdele duruyordu. Pip ikisi için de uyarılmıştı. Hem de iki kez.</w:t>
+        <w:t xml:space="preserve">O sabah hepimiz oradaydık. Kimsenin soğuk algınlığıyla yatağa düşmediği ya da torun bakmadığı günlerdeki gibi, bütün çember oradaydı. Olivia, kendi dükkânının başköşesinde, bir kışın isteyebileceği her renkte üst üste yığılmış yün çilelerinin arasında oturuyordu. Hemen yanında sade ve çevik Dot vardı. Sonra, Gazette için yazan Claire Bennett; sandalyesinin kolçağında açık duran defteriyle, çünkü Claire hiçbir zaman tam anlamıyla mesai dışı sayılmazdı. Bir satır karalamak için çelengini sürekli elinden bırakıyor, sonra bizlerin bir adım gerisinden yeniden eline alıyordu. Hemen yanında Ivy; gülüşü öyle gür ve öyle hazırdı ki onun varlığı bile dükkânı daha aydınlık gösteriyordu. Farkında bile olmadan saçına köknar reçinesi bulaştırmıştı. Martha, emekli öğretmen; yıllardır dul, küçük beyaz köpeği Snowball ayak bileğine kıvrılmış uyuyordu. Ara sıra eli, köpeğin kulağına dokunmak için aşağı sarkıyordu. Hâlâ orada olduğundan emin olmak için. Ve Ellie; kibar ve acelecesiz, haftada üç gün hastanede gönüllü çalışıyordu. O sarsılmaz şefkati bir tel iskelete bile taşıyordu. Çelengi yapılmıştan ziyade adeta doğmuş gibi görünüyordu.</w:t>
+      </w:r>
+    </w:p>
+    <w:p>
+      <w:r>
+        <w:t xml:space="preserve">Ve Pip; çemberden biri değildi ama kimlerin hazır bulunduğunun sayımında dışarıda bırakılmaya şiddetle alınırdı. Ön pencerenin altına, kasım ayının o alçak güneşinin vurduğu tek noktaya yerleşmişti; Olivia’nın fark ettiğim kadarıyla geri almak için pek de uğraşmadığı yere düşmüş kırmızı bir yün çilesinden yaptığı yuvaya kurulmuştu. Orada pırıl pırıl ve memnun bir şekilde uzanıyordu, tek gözü yarı aralık halde olan biteni kolluyordu. Özellikle de parıldayan her şeyi. Parıldayan çok şey de vardı doğrusu. Olivia’nın masasının üzerinde yaldızlı kozalaklardan oluşan bir kavanoz, yanında da bir makara altın kurdele duruyordu. Pip ikisi için de uyarılmıştı. Hem de iki kez.</w:t>
       </w:r>
     </w:p>
     <w:p>
@@ -5335,7 +5335,7 @@
     </w:p>
     <w:p>
       <w:r>
-        <w:t xml:space="preserve">O zaman sekiz kadın, bir kutu kek, bir penguen ve uyuyan bir köpekle cidden işe koyulduk. Sohbet, çember sohbetlerine mahsus olduğu üzere işin içine girip çıkıyor, dalları bağlamanın arasındaki boşluklarda bütün bir sabahın küçük haberleri paylaştırılıyordu. Ivy’nin kızının Concord’da yeni bir işi vardı. Claire’in Perşembe günü belediyenin kar küreme programıyla ilgili, kulağa geldiğinden çok daha ilginç olduğuna bizi yeminle inandırdığı bir yazısı çıkacaktı. Martha, günlerin o kadar hızlı kısaldığını, Emma’nın Snowball’u neredeyse karanlıkta yürütmeye geldiğini söyledi ve ben de çocuğa sevgilerimi iletmesini söyledim. Martha da Emma’nın her zaman Pip’i sorduğunu belirtti. Ve adını duyan, bunu övgü olarak haklı bir şekilde alan Pip tüylerini kabartıp memnun bir ifade takındı.</w:t>
+        <w:t xml:space="preserve">O zaman sekiz kadın, bir kutu kek, bir penguen ve uyuyan bir köpekle cidden işe koyulduk. Sohbet, çember sohbetlerine mahsus olduğu üzere işin içine girip çıkıyor, dalları bağlamanın arasındaki boşluklarda bütün bir sabahın küçük haberleri paylaştırılıyordu. Ivy’nin kızının Concord’da yeni bir işi vardı. Claire’in perşembe günü belediyenin kar küreme programıyla ilgili, kulağa geldiğinden çok daha ilginç olduğuna bizi yeminle inandırdığı bir yazısı çıkacaktı. Martha, günlerin o kadar hızlı kısaldığını, Emma’nın Snowball’u neredeyse karanlıkta yürütmeye geldiğini söyledi ve ben de çocuğa sevgilerimi iletmesini söyledim. Martha da Emma’nın her zaman Pip’i sorduğunu belirtti. Ve adını duyan, bunu övgü olarak haklı bir şekilde alan Pip tüylerini kabartıp memnun bir ifade takındı.</w:t>
       </w:r>
     </w:p>
     <w:p>
@@ -5360,7 +5360,7 @@
     </w:p>
     <w:p>
       <w:r>
-        <w:t xml:space="preserve">— Kahverengi kâğıtla, camların içinden. Hani bir yeri döşeyip hazırlarken kasabanın seni izlemesini istemediğinde yaptığın gibi. — Claire omuz silkti. — Tabela yok. İzin panosunda da henüz bir isim yok, baktım. Ama arka sokakta bir çöp konteyneri var ve Cumartesi günü orada bir minibüs duruyordu; bir yeri boşaltmıyorsan çöp konteyneri kiralamazsın.</w:t>
+        <w:t xml:space="preserve">— Kahverengi kâğıtla, camların içinden. Hani bir yeri döşeyip hazırlarken kasabanın seni izlemesini istemediğinde yaptığın gibi. — Claire omuz silkti. — Tabela yok. İzin panosunda da henüz bir isim yok, baktım. Ama arka sokakta bir çöp konteyneri var ve cumartesi günü orada bir minibüs duruyordu; bir yeri boşaltmıyorsan çöp konteyneri kiralamazsın.</w:t>
       </w:r>
     </w:p>
     <w:p>
@@ -5385,7 +5385,7 @@
     </w:p>
     <w:p>
       <w:r>
-        <w:t xml:space="preserve">— Bu da tuhaf doğrusu, dedi o yumuşak tonuyla ve sesindeki o hafiflik hepimizin başını kaldırmasına neden oldu. — Dün çocukların kardan adamları hep yola bakmıyor muydu?</w:t>
+        <w:t xml:space="preserve">— Bu da tuhaf doğrusu, dedi o yumuşak tonuyla ve sesindeki o hafiflik hepimizin başını kaldırmasına neden oldu. Dün çocukların kardan adamları hep yola bakmıyor muydu?</w:t>
       </w:r>
     </w:p>
     <w:p>

</xml_diff>